<commit_message>
Briefing and figures: two USB cameras on the Pi and two pan/tilt heads (4 x MG995) on Pico 2, no laser
The OV7670 module is replaced by two Logitech Brio 100 webcams connected to the
Raspberry Pi; Pico 2 only drives the servos (GP16-GP19), one 5 V / 5 A supply
per head.

Co-Authored-By: Claude Opus 5.5 <noreply@anthropic.com>
Claude-Session: https://claude.ai/code/session_01AXQwZoQ5RLqptuJChMNmSJ
</commit_message>
<xml_diff>
--- a/docs/reports/Claude_Code_Briefing.docx
+++ b/docs/reports/Claude_Code_Briefing.docx
@@ -33,7 +33,7 @@
           <w:szCs w:val="24"/>
           <w:rtl w:val="false"/>
         </w:rPr>
-        <w:t xml:space="preserve">Acoustic drone localization — hardware bring-up: microphone array, camera, pan/tilt pointer</w:t>
+        <w:t xml:space="preserve">Acoustic drone localization — hardware bring-up: microphone array, two USB cameras, two pan/tilt heads</w:t>
       </w:r>
     </w:p>
     <w:p>
@@ -49,7 +49,7 @@
           <w:szCs w:val="18"/>
           <w:rtl w:val="false"/>
         </w:rPr>
-        <w:t xml:space="preserve">Prepared 29 October 2026 · repository husham-eng/Multimodal-Reference-Subtraction-Voiceprint-and-Three-Dimensional-Sound-Meter-for-Drone-Localization · branch claude/epic-ride-9fqd2p</w:t>
+        <w:t xml:space="preserve">Updated 1 November 2026 · repository husham-eng/Multimodal-Reference-Subtraction-Voiceprint-and-Three-Dimensional-Sound-Meter-for-Drone-Localization · branch claude/epic-ride-9fqd2p</w:t>
       </w:r>
     </w:p>
     <w:p>
@@ -482,7 +482,7 @@
           <w:rFonts w:ascii="Arial" w:cs="Arial" w:eastAsia="Arial" w:hAnsi="Arial"/>
           <w:rtl w:val="false"/>
         </w:rPr>
-        <w:t xml:space="preserve">Safety: laser below 1 mW (class 2), indoor bench tests only, never towards people, aircraft or drones in flight; servos on their own 5 V supply.</w:t>
+        <w:t xml:space="preserve">Safety: servos on their own 5 V supplies (one per head), never from the Pico or the Pi; keep hands clear of the heads while they move.</w:t>
       </w:r>
     </w:p>
     <w:p>
@@ -1346,7 +1346,7 @@
           <w:rFonts w:ascii="Arial" w:cs="Arial" w:eastAsia="Arial" w:hAnsi="Arial"/>
           <w:rtl w:val="false"/>
         </w:rPr>
-        <w:t xml:space="preserve">Two Raspberry Pi Pico boards (RP2040), each on its own USB cable to the Raspberry Pi. There are no other wires between the Picos and the Pi, or between the two Picos. Each Pico is powered by its USB cable; the servos and the laser have a separate 5 V supply whose ground is joined to the ground of Pico 2.</w:t>
+        <w:t xml:space="preserve">Two Raspberry Pi Pico boards (RP2040) and two USB webcams, each on its own USB cable to the Raspberry Pi (assumed to be a Raspberry Pi 4: Picos on the two black USB 2 ports, cameras on the two blue USB 3 ports). There are no other wires between these devices and the Pi. Each Pico is powered by its USB cable; each pan/tilt head has its own 5 V supply whose ground is joined to the ground of Pico 2.</w:t>
       </w:r>
     </w:p>
     <w:p>
@@ -1358,7 +1358,7 @@
       <w:r>
         <w:drawing>
           <wp:inline distT="0" distB="0" distL="0" distR="0">
-            <wp:extent cx="5715000" cy="3800475"/>
+            <wp:extent cx="5715000" cy="3743325"/>
             <wp:effectExtent t="0" r="0" b="0" l="0"/>
             <wp:docPr id="1" name="" descr="" title=""/>
             <wp:cNvGraphicFramePr>
@@ -1383,7 +1383,7 @@
                   <pic:spPr bwMode="auto">
                     <a:xfrm>
                       <a:off x="0" y="0"/>
-                      <a:ext cx="5715000" cy="3800475"/>
+                      <a:ext cx="5715000" cy="3743325"/>
                     </a:xfrm>
                     <a:prstGeom prst="rect">
                       <a:avLst/>
@@ -1522,7 +1522,7 @@
                 <w:szCs w:val="19"/>
                 <w:rtl w:val="false"/>
               </w:rPr>
-              <w:t xml:space="preserve">Pico 2 – camera and pointer</w:t>
+              <w:t xml:space="preserve">Pico 2 – servo controller</w:t>
             </w:r>
           </w:p>
         </w:tc>
@@ -1809,7 +1809,7 @@
                 <w:szCs w:val="19"/>
                 <w:rtl w:val="false"/>
               </w:rPr>
-              <w:t xml:space="preserve">Camera frames, 160x120 grayscale, ~10–15 fps</w:t>
+              <w:t xml:space="preserve">Short status replies</w:t>
             </w:r>
           </w:p>
         </w:tc>
@@ -1898,7 +1898,7 @@
                 <w:szCs w:val="19"/>
                 <w:rtl w:val="false"/>
               </w:rPr>
-              <w:t xml:space="preserve">Pan/tilt angles, laser on/off</w:t>
+              <w:t xml:space="preserve">Pan/tilt angles for the two heads</w:t>
             </w:r>
           </w:p>
         </w:tc>
@@ -1987,7 +1987,7 @@
                 <w:szCs w:val="19"/>
                 <w:rtl w:val="false"/>
               </w:rPr>
-              <w:t xml:space="preserve">OV7670 camera (no FIFO, 18 pins), 2 x MG995 servos, laser &lt; 1 mW</w:t>
+              <w:t xml:space="preserve">4 x MG995 servos (upper and lower pan/tilt head)</w:t>
             </w:r>
           </w:p>
         </w:tc>
@@ -2044,7 +2044,7 @@
           <w:rFonts w:ascii="Arial" w:cs="Arial" w:eastAsia="Arial" w:hAnsi="Arial"/>
           <w:rtl w:val="false"/>
         </w:rPr>
-        <w:t xml:space="preserve">the user ordered the INMP441 microphones (expected around 1 November 2026) and a Raspberry Pi Pico (RP2040, without soldered headers: the 2 x 20 header strips must be soldered). They own an OV7670 (no-FIFO, 18-pin) camera. The user chose MG995 servos (the camera and laser add weight); the pan/tilt bracket and laser are still to be bought. An Adafruit BNO085 IMU (product 4754) was considered for a later phase (array orientation) and is not part of this bring-up.</w:t>
+        <w:t xml:space="preserve">the user ordered the INMP441 microphones (expected around 1 November 2026) and a Raspberry Pi Pico (RP2040, without soldered headers: the 2 x 20 header strips must be soldered). For the visual check they use two Logitech Brio 100 USB webcams (they replaced an OV7670 camera module) on two pan/tilt heads with four MG995 servos; there is no laser for now. Brackets and servo supplies are still to be bought. An Adafruit BNO085 IMU (product 4754) was considered for a later phase (array orientation) and is not part of this bring-up.</w:t>
       </w:r>
     </w:p>
     <w:p>
@@ -6861,7 +6861,7 @@
           <w:rFonts w:ascii="Arial" w:cs="Arial" w:eastAsia="Arial" w:hAnsi="Arial"/>
           <w:rtl w:val="false"/>
         </w:rPr>
-        <w:t xml:space="preserve">6. Pico 2: camera and pan/tilt laser pointer (to be implemented)</w:t>
+        <w:t xml:space="preserve">6. Pico 2, two pan/tilt heads and two USB cameras (to be implemented)</w:t>
       </w:r>
     </w:p>
     <w:p>
@@ -6873,7 +6873,7 @@
           <w:rFonts w:ascii="Arial" w:cs="Arial" w:eastAsia="Arial" w:hAnsi="Arial"/>
           <w:rtl w:val="false"/>
         </w:rPr>
-        <w:t xml:space="preserve">Purpose: visual and quantitative check of the acoustic direction estimate, and a tool to calibrate the array alignment. The pan/tilt head points along the estimated direction; indoors a laser dot shows where the system thinks a loudspeaker is; a camera on the same head shows whether the source is at the image centre, and the pixel offset gives the error in degrees. Outdoors the laser is useless (the dot is invisible against the sky) and must not be aimed at aircraft or drones: use the camera only.</w:t>
+        <w:t xml:space="preserve">Purpose: a visual and quantitative check of the acoustic direction estimate, and a tool to calibrate the array alignment. Each head carries a camera and points along the estimated direction; if the estimate is right, the sound source (a loudspeaker indoors, the drone outdoors) appears at the image centre, and its pixel offset gives the angular error in degrees. The upper head covers the upper hemisphere; the lower head, mounted upside down, covers the lower hemisphere. There is no laser in the current design.</w:t>
       </w:r>
     </w:p>
     <w:p>
@@ -6885,7 +6885,7 @@
       <w:r>
         <w:drawing>
           <wp:inline distT="0" distB="0" distL="0" distR="0">
-            <wp:extent cx="5715000" cy="4572000"/>
+            <wp:extent cx="5715000" cy="3838575"/>
             <wp:effectExtent t="0" r="0" b="0" l="0"/>
             <wp:docPr id="1" name="" descr="" title=""/>
             <wp:cNvGraphicFramePr>
@@ -6910,7 +6910,7 @@
                   <pic:spPr bwMode="auto">
                     <a:xfrm>
                       <a:off x="0" y="0"/>
-                      <a:ext cx="5715000" cy="4572000"/>
+                      <a:ext cx="5715000" cy="3838575"/>
                     </a:xfrm>
                     <a:prstGeom prst="rect">
                       <a:avLst/>
@@ -6936,7 +6936,7 @@
           <w:color w:val="444444"/>
           <w:rtl w:val="false"/>
         </w:rPr>
-        <w:t xml:space="preserve">Figure 4. Pico 2 wiring: OV7670 (no FIFO), pan/tilt servos and laser.</w:t>
+        <w:t xml:space="preserve">Figure 4. Pico 2 wiring: four MG995 servos in two heads, one 5 V / 5 A supply per head.</w:t>
       </w:r>
     </w:p>
     <w:p>
@@ -6948,7 +6948,7 @@
           <w:rFonts w:ascii="Arial" w:cs="Arial" w:eastAsia="Arial" w:hAnsi="Arial"/>
           <w:rtl w:val="false"/>
         </w:rPr>
-        <w:t xml:space="preserve">6.1 Pin assignment</w:t>
+        <w:t xml:space="preserve">6.1 Pin assignment (Pico 2)</w:t>
       </w:r>
     </w:p>
     <w:tbl>
@@ -6964,10 +6964,10 @@
         </w:tblBorders>
       </w:tblPr>
       <w:tblGrid>
-        <w:gridCol w:w="1900"/>
         <w:gridCol w:w="1500"/>
-        <w:gridCol w:w="2400"/>
-        <w:gridCol w:w="3800"/>
+        <w:gridCol w:w="1400"/>
+        <w:gridCol w:w="3000"/>
+        <w:gridCol w:w="3700"/>
       </w:tblGrid>
       <w:tr>
         <w:trPr>
@@ -6975,7 +6975,7 @@
         </w:trPr>
         <w:tc>
           <w:tcPr>
-            <w:tcW w:type="dxa" w:w="1900"/>
+            <w:tcW w:type="dxa" w:w="1500"/>
             <w:tcBorders>
               <w:top w:val="single" w:color="BBBBBB" w:sz="4"/>
               <w:left w:val="single" w:color="BBBBBB" w:sz="4"/>
@@ -7006,7 +7006,7 @@
         </w:tc>
         <w:tc>
           <w:tcPr>
-            <w:tcW w:type="dxa" w:w="1500"/>
+            <w:tcW w:type="dxa" w:w="1400"/>
             <w:tcBorders>
               <w:top w:val="single" w:color="BBBBBB" w:sz="4"/>
               <w:left w:val="single" w:color="BBBBBB" w:sz="4"/>
@@ -7037,7 +7037,7 @@
         </w:tc>
         <w:tc>
           <w:tcPr>
-            <w:tcW w:type="dxa" w:w="2400"/>
+            <w:tcW w:type="dxa" w:w="3000"/>
             <w:tcBorders>
               <w:top w:val="single" w:color="BBBBBB" w:sz="4"/>
               <w:left w:val="single" w:color="BBBBBB" w:sz="4"/>
@@ -7068,7 +7068,7 @@
         </w:tc>
         <w:tc>
           <w:tcPr>
-            <w:tcW w:type="dxa" w:w="3800"/>
+            <w:tcW w:type="dxa" w:w="3700"/>
             <w:tcBorders>
               <w:top w:val="single" w:color="BBBBBB" w:sz="4"/>
               <w:left w:val="single" w:color="BBBBBB" w:sz="4"/>
@@ -7104,34 +7104,6 @@
         </w:trPr>
         <w:tc>
           <w:tcPr>
-            <w:tcW w:type="dxa" w:w="1900"/>
-            <w:tcBorders>
-              <w:top w:val="single" w:color="BBBBBB" w:sz="4"/>
-              <w:left w:val="single" w:color="BBBBBB" w:sz="4"/>
-              <w:bottom w:val="single" w:color="BBBBBB" w:sz="4"/>
-              <w:right w:val="single" w:color="BBBBBB" w:sz="4"/>
-            </w:tcBorders>
-            <w:tcMar>
-              <w:top w:type="dxa" w:w="50"/>
-              <w:left w:type="dxa" w:w="90"/>
-              <w:bottom w:type="dxa" w:w="50"/>
-              <w:right w:type="dxa" w:w="90"/>
-            </w:tcMar>
-          </w:tcPr>
-          <w:p>
-            <w:r>
-              <w:rPr>
-                <w:rFonts w:ascii="Arial" w:cs="Arial" w:eastAsia="Arial" w:hAnsi="Arial"/>
-                <w:sz w:val="19"/>
-                <w:szCs w:val="19"/>
-                <w:rtl w:val="false"/>
-              </w:rPr>
-              <w:t xml:space="preserve">1, 2, 4, 5, 6, 7, 9, 10</w:t>
-            </w:r>
-          </w:p>
-        </w:tc>
-        <w:tc>
-          <w:tcPr>
             <w:tcW w:type="dxa" w:w="1500"/>
             <w:tcBorders>
               <w:top w:val="single" w:color="BBBBBB" w:sz="4"/>
@@ -7154,63 +7126,91 @@
                 <w:szCs w:val="19"/>
                 <w:rtl w:val="false"/>
               </w:rPr>
-              <w:t xml:space="preserve">GP0–GP7</w:t>
-            </w:r>
-          </w:p>
-        </w:tc>
-        <w:tc>
-          <w:tcPr>
-            <w:tcW w:type="dxa" w:w="2400"/>
-            <w:tcBorders>
-              <w:top w:val="single" w:color="BBBBBB" w:sz="4"/>
-              <w:left w:val="single" w:color="BBBBBB" w:sz="4"/>
-              <w:bottom w:val="single" w:color="BBBBBB" w:sz="4"/>
-              <w:right w:val="single" w:color="BBBBBB" w:sz="4"/>
-            </w:tcBorders>
-            <w:tcMar>
-              <w:top w:type="dxa" w:w="50"/>
-              <w:left w:type="dxa" w:w="90"/>
-              <w:bottom w:type="dxa" w:w="50"/>
-              <w:right w:type="dxa" w:w="90"/>
-            </w:tcMar>
-          </w:tcPr>
-          <w:p>
-            <w:r>
-              <w:rPr>
-                <w:rFonts w:ascii="Arial" w:cs="Arial" w:eastAsia="Arial" w:hAnsi="Arial"/>
-                <w:sz w:val="19"/>
-                <w:szCs w:val="19"/>
-                <w:rtl w:val="false"/>
-              </w:rPr>
-              <w:t xml:space="preserve">OV7670 D0–D7</w:t>
-            </w:r>
-          </w:p>
-        </w:tc>
-        <w:tc>
-          <w:tcPr>
-            <w:tcW w:type="dxa" w:w="3800"/>
-            <w:tcBorders>
-              <w:top w:val="single" w:color="BBBBBB" w:sz="4"/>
-              <w:left w:val="single" w:color="BBBBBB" w:sz="4"/>
-              <w:bottom w:val="single" w:color="BBBBBB" w:sz="4"/>
-              <w:right w:val="single" w:color="BBBBBB" w:sz="4"/>
-            </w:tcBorders>
-            <w:tcMar>
-              <w:top w:type="dxa" w:w="50"/>
-              <w:left w:type="dxa" w:w="90"/>
-              <w:bottom w:type="dxa" w:w="50"/>
-              <w:right w:type="dxa" w:w="90"/>
-            </w:tcMar>
-          </w:tcPr>
-          <w:p>
-            <w:r>
-              <w:rPr>
-                <w:rFonts w:ascii="Arial" w:cs="Arial" w:eastAsia="Arial" w:hAnsi="Arial"/>
-                <w:sz w:val="19"/>
-                <w:szCs w:val="19"/>
-                <w:rtl w:val="false"/>
-              </w:rPr>
-              <w:t xml:space="preserve">Consecutive GPIOs, read by one PIO program</w:t>
+              <w:t xml:space="preserve">21</w:t>
+            </w:r>
+          </w:p>
+        </w:tc>
+        <w:tc>
+          <w:tcPr>
+            <w:tcW w:type="dxa" w:w="1400"/>
+            <w:tcBorders>
+              <w:top w:val="single" w:color="BBBBBB" w:sz="4"/>
+              <w:left w:val="single" w:color="BBBBBB" w:sz="4"/>
+              <w:bottom w:val="single" w:color="BBBBBB" w:sz="4"/>
+              <w:right w:val="single" w:color="BBBBBB" w:sz="4"/>
+            </w:tcBorders>
+            <w:tcMar>
+              <w:top w:type="dxa" w:w="50"/>
+              <w:left w:type="dxa" w:w="90"/>
+              <w:bottom w:type="dxa" w:w="50"/>
+              <w:right w:type="dxa" w:w="90"/>
+            </w:tcMar>
+          </w:tcPr>
+          <w:p>
+            <w:r>
+              <w:rPr>
+                <w:rFonts w:ascii="Arial" w:cs="Arial" w:eastAsia="Arial" w:hAnsi="Arial"/>
+                <w:sz w:val="19"/>
+                <w:szCs w:val="19"/>
+                <w:rtl w:val="false"/>
+              </w:rPr>
+              <w:t xml:space="preserve">GP16</w:t>
+            </w:r>
+          </w:p>
+        </w:tc>
+        <w:tc>
+          <w:tcPr>
+            <w:tcW w:type="dxa" w:w="3000"/>
+            <w:tcBorders>
+              <w:top w:val="single" w:color="BBBBBB" w:sz="4"/>
+              <w:left w:val="single" w:color="BBBBBB" w:sz="4"/>
+              <w:bottom w:val="single" w:color="BBBBBB" w:sz="4"/>
+              <w:right w:val="single" w:color="BBBBBB" w:sz="4"/>
+            </w:tcBorders>
+            <w:tcMar>
+              <w:top w:type="dxa" w:w="50"/>
+              <w:left w:type="dxa" w:w="90"/>
+              <w:bottom w:type="dxa" w:w="50"/>
+              <w:right w:type="dxa" w:w="90"/>
+            </w:tcMar>
+          </w:tcPr>
+          <w:p>
+            <w:r>
+              <w:rPr>
+                <w:rFonts w:ascii="Arial" w:cs="Arial" w:eastAsia="Arial" w:hAnsi="Arial"/>
+                <w:sz w:val="19"/>
+                <w:szCs w:val="19"/>
+                <w:rtl w:val="false"/>
+              </w:rPr>
+              <w:t xml:space="preserve">Upper head – pan</w:t>
+            </w:r>
+          </w:p>
+        </w:tc>
+        <w:tc>
+          <w:tcPr>
+            <w:tcW w:type="dxa" w:w="3700"/>
+            <w:tcBorders>
+              <w:top w:val="single" w:color="BBBBBB" w:sz="4"/>
+              <w:left w:val="single" w:color="BBBBBB" w:sz="4"/>
+              <w:bottom w:val="single" w:color="BBBBBB" w:sz="4"/>
+              <w:right w:val="single" w:color="BBBBBB" w:sz="4"/>
+            </w:tcBorders>
+            <w:tcMar>
+              <w:top w:type="dxa" w:w="50"/>
+              <w:left w:type="dxa" w:w="90"/>
+              <w:bottom w:type="dxa" w:w="50"/>
+              <w:right w:type="dxa" w:w="90"/>
+            </w:tcMar>
+          </w:tcPr>
+          <w:p>
+            <w:r>
+              <w:rPr>
+                <w:rFonts w:ascii="Arial" w:cs="Arial" w:eastAsia="Arial" w:hAnsi="Arial"/>
+                <w:sz w:val="19"/>
+                <w:szCs w:val="19"/>
+                <w:rtl w:val="false"/>
+              </w:rPr>
+              <w:t xml:space="preserve">Hardware PWM (slice 0A), 50 Hz</w:t>
             </w:r>
           </w:p>
         </w:tc>
@@ -7221,34 +7221,6 @@
         </w:trPr>
         <w:tc>
           <w:tcPr>
-            <w:tcW w:type="dxa" w:w="1900"/>
-            <w:tcBorders>
-              <w:top w:val="single" w:color="BBBBBB" w:sz="4"/>
-              <w:left w:val="single" w:color="BBBBBB" w:sz="4"/>
-              <w:bottom w:val="single" w:color="BBBBBB" w:sz="4"/>
-              <w:right w:val="single" w:color="BBBBBB" w:sz="4"/>
-            </w:tcBorders>
-            <w:tcMar>
-              <w:top w:type="dxa" w:w="50"/>
-              <w:left w:type="dxa" w:w="90"/>
-              <w:bottom w:type="dxa" w:w="50"/>
-              <w:right w:type="dxa" w:w="90"/>
-            </w:tcMar>
-          </w:tcPr>
-          <w:p>
-            <w:r>
-              <w:rPr>
-                <w:rFonts w:ascii="Arial" w:cs="Arial" w:eastAsia="Arial" w:hAnsi="Arial"/>
-                <w:sz w:val="19"/>
-                <w:szCs w:val="19"/>
-                <w:rtl w:val="false"/>
-              </w:rPr>
-              <w:t xml:space="preserve">11</w:t>
-            </w:r>
-          </w:p>
-        </w:tc>
-        <w:tc>
-          <w:tcPr>
             <w:tcW w:type="dxa" w:w="1500"/>
             <w:tcBorders>
               <w:top w:val="single" w:color="BBBBBB" w:sz="4"/>
@@ -7271,63 +7243,91 @@
                 <w:szCs w:val="19"/>
                 <w:rtl w:val="false"/>
               </w:rPr>
-              <w:t xml:space="preserve">GP8</w:t>
-            </w:r>
-          </w:p>
-        </w:tc>
-        <w:tc>
-          <w:tcPr>
-            <w:tcW w:type="dxa" w:w="2400"/>
-            <w:tcBorders>
-              <w:top w:val="single" w:color="BBBBBB" w:sz="4"/>
-              <w:left w:val="single" w:color="BBBBBB" w:sz="4"/>
-              <w:bottom w:val="single" w:color="BBBBBB" w:sz="4"/>
-              <w:right w:val="single" w:color="BBBBBB" w:sz="4"/>
-            </w:tcBorders>
-            <w:tcMar>
-              <w:top w:type="dxa" w:w="50"/>
-              <w:left w:type="dxa" w:w="90"/>
-              <w:bottom w:type="dxa" w:w="50"/>
-              <w:right w:type="dxa" w:w="90"/>
-            </w:tcMar>
-          </w:tcPr>
-          <w:p>
-            <w:r>
-              <w:rPr>
-                <w:rFonts w:ascii="Arial" w:cs="Arial" w:eastAsia="Arial" w:hAnsi="Arial"/>
-                <w:sz w:val="19"/>
-                <w:szCs w:val="19"/>
-                <w:rtl w:val="false"/>
-              </w:rPr>
-              <w:t xml:space="preserve">PCLK (camera → Pico)</w:t>
-            </w:r>
-          </w:p>
-        </w:tc>
-        <w:tc>
-          <w:tcPr>
-            <w:tcW w:type="dxa" w:w="3800"/>
-            <w:tcBorders>
-              <w:top w:val="single" w:color="BBBBBB" w:sz="4"/>
-              <w:left w:val="single" w:color="BBBBBB" w:sz="4"/>
-              <w:bottom w:val="single" w:color="BBBBBB" w:sz="4"/>
-              <w:right w:val="single" w:color="BBBBBB" w:sz="4"/>
-            </w:tcBorders>
-            <w:tcMar>
-              <w:top w:type="dxa" w:w="50"/>
-              <w:left w:type="dxa" w:w="90"/>
-              <w:bottom w:type="dxa" w:w="50"/>
-              <w:right w:type="dxa" w:w="90"/>
-            </w:tcMar>
-          </w:tcPr>
-          <w:p>
-            <w:r>
-              <w:rPr>
-                <w:rFonts w:ascii="Arial" w:cs="Arial" w:eastAsia="Arial" w:hAnsi="Arial"/>
-                <w:sz w:val="19"/>
-                <w:szCs w:val="19"/>
-                <w:rtl w:val="false"/>
-              </w:rPr>
-              <w:t xml:space="preserve">Pixel clock</w:t>
+              <w:t xml:space="preserve">22</w:t>
+            </w:r>
+          </w:p>
+        </w:tc>
+        <w:tc>
+          <w:tcPr>
+            <w:tcW w:type="dxa" w:w="1400"/>
+            <w:tcBorders>
+              <w:top w:val="single" w:color="BBBBBB" w:sz="4"/>
+              <w:left w:val="single" w:color="BBBBBB" w:sz="4"/>
+              <w:bottom w:val="single" w:color="BBBBBB" w:sz="4"/>
+              <w:right w:val="single" w:color="BBBBBB" w:sz="4"/>
+            </w:tcBorders>
+            <w:tcMar>
+              <w:top w:type="dxa" w:w="50"/>
+              <w:left w:type="dxa" w:w="90"/>
+              <w:bottom w:type="dxa" w:w="50"/>
+              <w:right w:type="dxa" w:w="90"/>
+            </w:tcMar>
+          </w:tcPr>
+          <w:p>
+            <w:r>
+              <w:rPr>
+                <w:rFonts w:ascii="Arial" w:cs="Arial" w:eastAsia="Arial" w:hAnsi="Arial"/>
+                <w:sz w:val="19"/>
+                <w:szCs w:val="19"/>
+                <w:rtl w:val="false"/>
+              </w:rPr>
+              <w:t xml:space="preserve">GP17</w:t>
+            </w:r>
+          </w:p>
+        </w:tc>
+        <w:tc>
+          <w:tcPr>
+            <w:tcW w:type="dxa" w:w="3000"/>
+            <w:tcBorders>
+              <w:top w:val="single" w:color="BBBBBB" w:sz="4"/>
+              <w:left w:val="single" w:color="BBBBBB" w:sz="4"/>
+              <w:bottom w:val="single" w:color="BBBBBB" w:sz="4"/>
+              <w:right w:val="single" w:color="BBBBBB" w:sz="4"/>
+            </w:tcBorders>
+            <w:tcMar>
+              <w:top w:type="dxa" w:w="50"/>
+              <w:left w:type="dxa" w:w="90"/>
+              <w:bottom w:type="dxa" w:w="50"/>
+              <w:right w:type="dxa" w:w="90"/>
+            </w:tcMar>
+          </w:tcPr>
+          <w:p>
+            <w:r>
+              <w:rPr>
+                <w:rFonts w:ascii="Arial" w:cs="Arial" w:eastAsia="Arial" w:hAnsi="Arial"/>
+                <w:sz w:val="19"/>
+                <w:szCs w:val="19"/>
+                <w:rtl w:val="false"/>
+              </w:rPr>
+              <w:t xml:space="preserve">Upper head – tilt</w:t>
+            </w:r>
+          </w:p>
+        </w:tc>
+        <w:tc>
+          <w:tcPr>
+            <w:tcW w:type="dxa" w:w="3700"/>
+            <w:tcBorders>
+              <w:top w:val="single" w:color="BBBBBB" w:sz="4"/>
+              <w:left w:val="single" w:color="BBBBBB" w:sz="4"/>
+              <w:bottom w:val="single" w:color="BBBBBB" w:sz="4"/>
+              <w:right w:val="single" w:color="BBBBBB" w:sz="4"/>
+            </w:tcBorders>
+            <w:tcMar>
+              <w:top w:type="dxa" w:w="50"/>
+              <w:left w:type="dxa" w:w="90"/>
+              <w:bottom w:type="dxa" w:w="50"/>
+              <w:right w:type="dxa" w:w="90"/>
+            </w:tcMar>
+          </w:tcPr>
+          <w:p>
+            <w:r>
+              <w:rPr>
+                <w:rFonts w:ascii="Arial" w:cs="Arial" w:eastAsia="Arial" w:hAnsi="Arial"/>
+                <w:sz w:val="19"/>
+                <w:szCs w:val="19"/>
+                <w:rtl w:val="false"/>
+              </w:rPr>
+              <w:t xml:space="preserve">Hardware PWM (slice 0B)</w:t>
             </w:r>
           </w:p>
         </w:tc>
@@ -7338,34 +7338,6 @@
         </w:trPr>
         <w:tc>
           <w:tcPr>
-            <w:tcW w:type="dxa" w:w="1900"/>
-            <w:tcBorders>
-              <w:top w:val="single" w:color="BBBBBB" w:sz="4"/>
-              <w:left w:val="single" w:color="BBBBBB" w:sz="4"/>
-              <w:bottom w:val="single" w:color="BBBBBB" w:sz="4"/>
-              <w:right w:val="single" w:color="BBBBBB" w:sz="4"/>
-            </w:tcBorders>
-            <w:tcMar>
-              <w:top w:type="dxa" w:w="50"/>
-              <w:left w:type="dxa" w:w="90"/>
-              <w:bottom w:type="dxa" w:w="50"/>
-              <w:right w:type="dxa" w:w="90"/>
-            </w:tcMar>
-          </w:tcPr>
-          <w:p>
-            <w:r>
-              <w:rPr>
-                <w:rFonts w:ascii="Arial" w:cs="Arial" w:eastAsia="Arial" w:hAnsi="Arial"/>
-                <w:sz w:val="19"/>
-                <w:szCs w:val="19"/>
-                <w:rtl w:val="false"/>
-              </w:rPr>
-              <w:t xml:space="preserve">12</w:t>
-            </w:r>
-          </w:p>
-        </w:tc>
-        <w:tc>
-          <w:tcPr>
             <w:tcW w:type="dxa" w:w="1500"/>
             <w:tcBorders>
               <w:top w:val="single" w:color="BBBBBB" w:sz="4"/>
@@ -7388,63 +7360,91 @@
                 <w:szCs w:val="19"/>
                 <w:rtl w:val="false"/>
               </w:rPr>
-              <w:t xml:space="preserve">GP9</w:t>
-            </w:r>
-          </w:p>
-        </w:tc>
-        <w:tc>
-          <w:tcPr>
-            <w:tcW w:type="dxa" w:w="2400"/>
-            <w:tcBorders>
-              <w:top w:val="single" w:color="BBBBBB" w:sz="4"/>
-              <w:left w:val="single" w:color="BBBBBB" w:sz="4"/>
-              <w:bottom w:val="single" w:color="BBBBBB" w:sz="4"/>
-              <w:right w:val="single" w:color="BBBBBB" w:sz="4"/>
-            </w:tcBorders>
-            <w:tcMar>
-              <w:top w:type="dxa" w:w="50"/>
-              <w:left w:type="dxa" w:w="90"/>
-              <w:bottom w:type="dxa" w:w="50"/>
-              <w:right w:type="dxa" w:w="90"/>
-            </w:tcMar>
-          </w:tcPr>
-          <w:p>
-            <w:r>
-              <w:rPr>
-                <w:rFonts w:ascii="Arial" w:cs="Arial" w:eastAsia="Arial" w:hAnsi="Arial"/>
-                <w:sz w:val="19"/>
-                <w:szCs w:val="19"/>
-                <w:rtl w:val="false"/>
-              </w:rPr>
-              <w:t xml:space="preserve">HREF</w:t>
-            </w:r>
-          </w:p>
-        </w:tc>
-        <w:tc>
-          <w:tcPr>
-            <w:tcW w:type="dxa" w:w="3800"/>
-            <w:tcBorders>
-              <w:top w:val="single" w:color="BBBBBB" w:sz="4"/>
-              <w:left w:val="single" w:color="BBBBBB" w:sz="4"/>
-              <w:bottom w:val="single" w:color="BBBBBB" w:sz="4"/>
-              <w:right w:val="single" w:color="BBBBBB" w:sz="4"/>
-            </w:tcBorders>
-            <w:tcMar>
-              <w:top w:type="dxa" w:w="50"/>
-              <w:left w:type="dxa" w:w="90"/>
-              <w:bottom w:type="dxa" w:w="50"/>
-              <w:right w:type="dxa" w:w="90"/>
-            </w:tcMar>
-          </w:tcPr>
-          <w:p>
-            <w:r>
-              <w:rPr>
-                <w:rFonts w:ascii="Arial" w:cs="Arial" w:eastAsia="Arial" w:hAnsi="Arial"/>
-                <w:sz w:val="19"/>
-                <w:szCs w:val="19"/>
-                <w:rtl w:val="false"/>
-              </w:rPr>
-              <w:t xml:space="preserve">Line valid</w:t>
+              <w:t xml:space="preserve">24</w:t>
+            </w:r>
+          </w:p>
+        </w:tc>
+        <w:tc>
+          <w:tcPr>
+            <w:tcW w:type="dxa" w:w="1400"/>
+            <w:tcBorders>
+              <w:top w:val="single" w:color="BBBBBB" w:sz="4"/>
+              <w:left w:val="single" w:color="BBBBBB" w:sz="4"/>
+              <w:bottom w:val="single" w:color="BBBBBB" w:sz="4"/>
+              <w:right w:val="single" w:color="BBBBBB" w:sz="4"/>
+            </w:tcBorders>
+            <w:tcMar>
+              <w:top w:type="dxa" w:w="50"/>
+              <w:left w:type="dxa" w:w="90"/>
+              <w:bottom w:type="dxa" w:w="50"/>
+              <w:right w:type="dxa" w:w="90"/>
+            </w:tcMar>
+          </w:tcPr>
+          <w:p>
+            <w:r>
+              <w:rPr>
+                <w:rFonts w:ascii="Arial" w:cs="Arial" w:eastAsia="Arial" w:hAnsi="Arial"/>
+                <w:sz w:val="19"/>
+                <w:szCs w:val="19"/>
+                <w:rtl w:val="false"/>
+              </w:rPr>
+              <w:t xml:space="preserve">GP18</w:t>
+            </w:r>
+          </w:p>
+        </w:tc>
+        <w:tc>
+          <w:tcPr>
+            <w:tcW w:type="dxa" w:w="3000"/>
+            <w:tcBorders>
+              <w:top w:val="single" w:color="BBBBBB" w:sz="4"/>
+              <w:left w:val="single" w:color="BBBBBB" w:sz="4"/>
+              <w:bottom w:val="single" w:color="BBBBBB" w:sz="4"/>
+              <w:right w:val="single" w:color="BBBBBB" w:sz="4"/>
+            </w:tcBorders>
+            <w:tcMar>
+              <w:top w:type="dxa" w:w="50"/>
+              <w:left w:type="dxa" w:w="90"/>
+              <w:bottom w:type="dxa" w:w="50"/>
+              <w:right w:type="dxa" w:w="90"/>
+            </w:tcMar>
+          </w:tcPr>
+          <w:p>
+            <w:r>
+              <w:rPr>
+                <w:rFonts w:ascii="Arial" w:cs="Arial" w:eastAsia="Arial" w:hAnsi="Arial"/>
+                <w:sz w:val="19"/>
+                <w:szCs w:val="19"/>
+                <w:rtl w:val="false"/>
+              </w:rPr>
+              <w:t xml:space="preserve">Lower head – pan</w:t>
+            </w:r>
+          </w:p>
+        </w:tc>
+        <w:tc>
+          <w:tcPr>
+            <w:tcW w:type="dxa" w:w="3700"/>
+            <w:tcBorders>
+              <w:top w:val="single" w:color="BBBBBB" w:sz="4"/>
+              <w:left w:val="single" w:color="BBBBBB" w:sz="4"/>
+              <w:bottom w:val="single" w:color="BBBBBB" w:sz="4"/>
+              <w:right w:val="single" w:color="BBBBBB" w:sz="4"/>
+            </w:tcBorders>
+            <w:tcMar>
+              <w:top w:type="dxa" w:w="50"/>
+              <w:left w:type="dxa" w:w="90"/>
+              <w:bottom w:type="dxa" w:w="50"/>
+              <w:right w:type="dxa" w:w="90"/>
+            </w:tcMar>
+          </w:tcPr>
+          <w:p>
+            <w:r>
+              <w:rPr>
+                <w:rFonts w:ascii="Arial" w:cs="Arial" w:eastAsia="Arial" w:hAnsi="Arial"/>
+                <w:sz w:val="19"/>
+                <w:szCs w:val="19"/>
+                <w:rtl w:val="false"/>
+              </w:rPr>
+              <w:t xml:space="preserve">Hardware PWM (slice 1A)</w:t>
             </w:r>
           </w:p>
         </w:tc>
@@ -7455,34 +7455,6 @@
         </w:trPr>
         <w:tc>
           <w:tcPr>
-            <w:tcW w:type="dxa" w:w="1900"/>
-            <w:tcBorders>
-              <w:top w:val="single" w:color="BBBBBB" w:sz="4"/>
-              <w:left w:val="single" w:color="BBBBBB" w:sz="4"/>
-              <w:bottom w:val="single" w:color="BBBBBB" w:sz="4"/>
-              <w:right w:val="single" w:color="BBBBBB" w:sz="4"/>
-            </w:tcBorders>
-            <w:tcMar>
-              <w:top w:type="dxa" w:w="50"/>
-              <w:left w:type="dxa" w:w="90"/>
-              <w:bottom w:type="dxa" w:w="50"/>
-              <w:right w:type="dxa" w:w="90"/>
-            </w:tcMar>
-          </w:tcPr>
-          <w:p>
-            <w:r>
-              <w:rPr>
-                <w:rFonts w:ascii="Arial" w:cs="Arial" w:eastAsia="Arial" w:hAnsi="Arial"/>
-                <w:sz w:val="19"/>
-                <w:szCs w:val="19"/>
-                <w:rtl w:val="false"/>
-              </w:rPr>
-              <w:t xml:space="preserve">14</w:t>
-            </w:r>
-          </w:p>
-        </w:tc>
-        <w:tc>
-          <w:tcPr>
             <w:tcW w:type="dxa" w:w="1500"/>
             <w:tcBorders>
               <w:top w:val="single" w:color="BBBBBB" w:sz="4"/>
@@ -7505,63 +7477,91 @@
                 <w:szCs w:val="19"/>
                 <w:rtl w:val="false"/>
               </w:rPr>
-              <w:t xml:space="preserve">GP10</w:t>
-            </w:r>
-          </w:p>
-        </w:tc>
-        <w:tc>
-          <w:tcPr>
-            <w:tcW w:type="dxa" w:w="2400"/>
-            <w:tcBorders>
-              <w:top w:val="single" w:color="BBBBBB" w:sz="4"/>
-              <w:left w:val="single" w:color="BBBBBB" w:sz="4"/>
-              <w:bottom w:val="single" w:color="BBBBBB" w:sz="4"/>
-              <w:right w:val="single" w:color="BBBBBB" w:sz="4"/>
-            </w:tcBorders>
-            <w:tcMar>
-              <w:top w:type="dxa" w:w="50"/>
-              <w:left w:type="dxa" w:w="90"/>
-              <w:bottom w:type="dxa" w:w="50"/>
-              <w:right w:type="dxa" w:w="90"/>
-            </w:tcMar>
-          </w:tcPr>
-          <w:p>
-            <w:r>
-              <w:rPr>
-                <w:rFonts w:ascii="Arial" w:cs="Arial" w:eastAsia="Arial" w:hAnsi="Arial"/>
-                <w:sz w:val="19"/>
-                <w:szCs w:val="19"/>
-                <w:rtl w:val="false"/>
-              </w:rPr>
-              <w:t xml:space="preserve">VSYNC</w:t>
-            </w:r>
-          </w:p>
-        </w:tc>
-        <w:tc>
-          <w:tcPr>
-            <w:tcW w:type="dxa" w:w="3800"/>
-            <w:tcBorders>
-              <w:top w:val="single" w:color="BBBBBB" w:sz="4"/>
-              <w:left w:val="single" w:color="BBBBBB" w:sz="4"/>
-              <w:bottom w:val="single" w:color="BBBBBB" w:sz="4"/>
-              <w:right w:val="single" w:color="BBBBBB" w:sz="4"/>
-            </w:tcBorders>
-            <w:tcMar>
-              <w:top w:type="dxa" w:w="50"/>
-              <w:left w:type="dxa" w:w="90"/>
-              <w:bottom w:type="dxa" w:w="50"/>
-              <w:right w:type="dxa" w:w="90"/>
-            </w:tcMar>
-          </w:tcPr>
-          <w:p>
-            <w:r>
-              <w:rPr>
-                <w:rFonts w:ascii="Arial" w:cs="Arial" w:eastAsia="Arial" w:hAnsi="Arial"/>
-                <w:sz w:val="19"/>
-                <w:szCs w:val="19"/>
-                <w:rtl w:val="false"/>
-              </w:rPr>
-              <w:t xml:space="preserve">Frame start</w:t>
+              <w:t xml:space="preserve">25</w:t>
+            </w:r>
+          </w:p>
+        </w:tc>
+        <w:tc>
+          <w:tcPr>
+            <w:tcW w:type="dxa" w:w="1400"/>
+            <w:tcBorders>
+              <w:top w:val="single" w:color="BBBBBB" w:sz="4"/>
+              <w:left w:val="single" w:color="BBBBBB" w:sz="4"/>
+              <w:bottom w:val="single" w:color="BBBBBB" w:sz="4"/>
+              <w:right w:val="single" w:color="BBBBBB" w:sz="4"/>
+            </w:tcBorders>
+            <w:tcMar>
+              <w:top w:type="dxa" w:w="50"/>
+              <w:left w:type="dxa" w:w="90"/>
+              <w:bottom w:type="dxa" w:w="50"/>
+              <w:right w:type="dxa" w:w="90"/>
+            </w:tcMar>
+          </w:tcPr>
+          <w:p>
+            <w:r>
+              <w:rPr>
+                <w:rFonts w:ascii="Arial" w:cs="Arial" w:eastAsia="Arial" w:hAnsi="Arial"/>
+                <w:sz w:val="19"/>
+                <w:szCs w:val="19"/>
+                <w:rtl w:val="false"/>
+              </w:rPr>
+              <w:t xml:space="preserve">GP19</w:t>
+            </w:r>
+          </w:p>
+        </w:tc>
+        <w:tc>
+          <w:tcPr>
+            <w:tcW w:type="dxa" w:w="3000"/>
+            <w:tcBorders>
+              <w:top w:val="single" w:color="BBBBBB" w:sz="4"/>
+              <w:left w:val="single" w:color="BBBBBB" w:sz="4"/>
+              <w:bottom w:val="single" w:color="BBBBBB" w:sz="4"/>
+              <w:right w:val="single" w:color="BBBBBB" w:sz="4"/>
+            </w:tcBorders>
+            <w:tcMar>
+              <w:top w:type="dxa" w:w="50"/>
+              <w:left w:type="dxa" w:w="90"/>
+              <w:bottom w:type="dxa" w:w="50"/>
+              <w:right w:type="dxa" w:w="90"/>
+            </w:tcMar>
+          </w:tcPr>
+          <w:p>
+            <w:r>
+              <w:rPr>
+                <w:rFonts w:ascii="Arial" w:cs="Arial" w:eastAsia="Arial" w:hAnsi="Arial"/>
+                <w:sz w:val="19"/>
+                <w:szCs w:val="19"/>
+                <w:rtl w:val="false"/>
+              </w:rPr>
+              <w:t xml:space="preserve">Lower head – tilt</w:t>
+            </w:r>
+          </w:p>
+        </w:tc>
+        <w:tc>
+          <w:tcPr>
+            <w:tcW w:type="dxa" w:w="3700"/>
+            <w:tcBorders>
+              <w:top w:val="single" w:color="BBBBBB" w:sz="4"/>
+              <w:left w:val="single" w:color="BBBBBB" w:sz="4"/>
+              <w:bottom w:val="single" w:color="BBBBBB" w:sz="4"/>
+              <w:right w:val="single" w:color="BBBBBB" w:sz="4"/>
+            </w:tcBorders>
+            <w:tcMar>
+              <w:top w:type="dxa" w:w="50"/>
+              <w:left w:type="dxa" w:w="90"/>
+              <w:bottom w:type="dxa" w:w="50"/>
+              <w:right w:type="dxa" w:w="90"/>
+            </w:tcMar>
+          </w:tcPr>
+          <w:p>
+            <w:r>
+              <w:rPr>
+                <w:rFonts w:ascii="Arial" w:cs="Arial" w:eastAsia="Arial" w:hAnsi="Arial"/>
+                <w:sz w:val="19"/>
+                <w:szCs w:val="19"/>
+                <w:rtl w:val="false"/>
+              </w:rPr>
+              <w:t xml:space="preserve">Hardware PWM (slice 1B)</w:t>
             </w:r>
           </w:p>
         </w:tc>
@@ -7572,34 +7572,6 @@
         </w:trPr>
         <w:tc>
           <w:tcPr>
-            <w:tcW w:type="dxa" w:w="1900"/>
-            <w:tcBorders>
-              <w:top w:val="single" w:color="BBBBBB" w:sz="4"/>
-              <w:left w:val="single" w:color="BBBBBB" w:sz="4"/>
-              <w:bottom w:val="single" w:color="BBBBBB" w:sz="4"/>
-              <w:right w:val="single" w:color="BBBBBB" w:sz="4"/>
-            </w:tcBorders>
-            <w:tcMar>
-              <w:top w:type="dxa" w:w="50"/>
-              <w:left w:type="dxa" w:w="90"/>
-              <w:bottom w:type="dxa" w:w="50"/>
-              <w:right w:type="dxa" w:w="90"/>
-            </w:tcMar>
-          </w:tcPr>
-          <w:p>
-            <w:r>
-              <w:rPr>
-                <w:rFonts w:ascii="Arial" w:cs="Arial" w:eastAsia="Arial" w:hAnsi="Arial"/>
-                <w:sz w:val="19"/>
-                <w:szCs w:val="19"/>
-                <w:rtl w:val="false"/>
-              </w:rPr>
-              <w:t xml:space="preserve">27</w:t>
-            </w:r>
-          </w:p>
-        </w:tc>
-        <w:tc>
-          <w:tcPr>
             <w:tcW w:type="dxa" w:w="1500"/>
             <w:tcBorders>
               <w:top w:val="single" w:color="BBBBBB" w:sz="4"/>
@@ -7622,63 +7594,91 @@
                 <w:szCs w:val="19"/>
                 <w:rtl w:val="false"/>
               </w:rPr>
-              <w:t xml:space="preserve">GP21</w:t>
-            </w:r>
-          </w:p>
-        </w:tc>
-        <w:tc>
-          <w:tcPr>
-            <w:tcW w:type="dxa" w:w="2400"/>
-            <w:tcBorders>
-              <w:top w:val="single" w:color="BBBBBB" w:sz="4"/>
-              <w:left w:val="single" w:color="BBBBBB" w:sz="4"/>
-              <w:bottom w:val="single" w:color="BBBBBB" w:sz="4"/>
-              <w:right w:val="single" w:color="BBBBBB" w:sz="4"/>
-            </w:tcBorders>
-            <w:tcMar>
-              <w:top w:type="dxa" w:w="50"/>
-              <w:left w:type="dxa" w:w="90"/>
-              <w:bottom w:type="dxa" w:w="50"/>
-              <w:right w:type="dxa" w:w="90"/>
-            </w:tcMar>
-          </w:tcPr>
-          <w:p>
-            <w:r>
-              <w:rPr>
-                <w:rFonts w:ascii="Arial" w:cs="Arial" w:eastAsia="Arial" w:hAnsi="Arial"/>
-                <w:sz w:val="19"/>
-                <w:szCs w:val="19"/>
-                <w:rtl w:val="false"/>
-              </w:rPr>
-              <w:t xml:space="preserve">XCLK (Pico → camera)</w:t>
-            </w:r>
-          </w:p>
-        </w:tc>
-        <w:tc>
-          <w:tcPr>
-            <w:tcW w:type="dxa" w:w="3800"/>
-            <w:tcBorders>
-              <w:top w:val="single" w:color="BBBBBB" w:sz="4"/>
-              <w:left w:val="single" w:color="BBBBBB" w:sz="4"/>
-              <w:bottom w:val="single" w:color="BBBBBB" w:sz="4"/>
-              <w:right w:val="single" w:color="BBBBBB" w:sz="4"/>
-            </w:tcBorders>
-            <w:tcMar>
-              <w:top w:type="dxa" w:w="50"/>
-              <w:left w:type="dxa" w:w="90"/>
-              <w:bottom w:type="dxa" w:w="50"/>
-              <w:right w:type="dxa" w:w="90"/>
-            </w:tcMar>
-          </w:tcPr>
-          <w:p>
-            <w:r>
-              <w:rPr>
-                <w:rFonts w:ascii="Arial" w:cs="Arial" w:eastAsia="Arial" w:hAnsi="Arial"/>
-                <w:sz w:val="19"/>
-                <w:szCs w:val="19"/>
-                <w:rtl w:val="false"/>
-              </w:rPr>
-              <w:t xml:space="preserve">Clock output (GPOUT0), 12–24 MHz</w:t>
+              <w:t xml:space="preserve">23</w:t>
+            </w:r>
+          </w:p>
+        </w:tc>
+        <w:tc>
+          <w:tcPr>
+            <w:tcW w:type="dxa" w:w="1400"/>
+            <w:tcBorders>
+              <w:top w:val="single" w:color="BBBBBB" w:sz="4"/>
+              <w:left w:val="single" w:color="BBBBBB" w:sz="4"/>
+              <w:bottom w:val="single" w:color="BBBBBB" w:sz="4"/>
+              <w:right w:val="single" w:color="BBBBBB" w:sz="4"/>
+            </w:tcBorders>
+            <w:tcMar>
+              <w:top w:type="dxa" w:w="50"/>
+              <w:left w:type="dxa" w:w="90"/>
+              <w:bottom w:type="dxa" w:w="50"/>
+              <w:right w:type="dxa" w:w="90"/>
+            </w:tcMar>
+          </w:tcPr>
+          <w:p>
+            <w:r>
+              <w:rPr>
+                <w:rFonts w:ascii="Arial" w:cs="Arial" w:eastAsia="Arial" w:hAnsi="Arial"/>
+                <w:sz w:val="19"/>
+                <w:szCs w:val="19"/>
+                <w:rtl w:val="false"/>
+              </w:rPr>
+              <w:t xml:space="preserve">GND</w:t>
+            </w:r>
+          </w:p>
+        </w:tc>
+        <w:tc>
+          <w:tcPr>
+            <w:tcW w:type="dxa" w:w="3000"/>
+            <w:tcBorders>
+              <w:top w:val="single" w:color="BBBBBB" w:sz="4"/>
+              <w:left w:val="single" w:color="BBBBBB" w:sz="4"/>
+              <w:bottom w:val="single" w:color="BBBBBB" w:sz="4"/>
+              <w:right w:val="single" w:color="BBBBBB" w:sz="4"/>
+            </w:tcBorders>
+            <w:tcMar>
+              <w:top w:type="dxa" w:w="50"/>
+              <w:left w:type="dxa" w:w="90"/>
+              <w:bottom w:type="dxa" w:w="50"/>
+              <w:right w:type="dxa" w:w="90"/>
+            </w:tcMar>
+          </w:tcPr>
+          <w:p>
+            <w:r>
+              <w:rPr>
+                <w:rFonts w:ascii="Arial" w:cs="Arial" w:eastAsia="Arial" w:hAnsi="Arial"/>
+                <w:sz w:val="19"/>
+                <w:szCs w:val="19"/>
+                <w:rtl w:val="false"/>
+              </w:rPr>
+              <w:t xml:space="preserve">Common ground</w:t>
+            </w:r>
+          </w:p>
+        </w:tc>
+        <w:tc>
+          <w:tcPr>
+            <w:tcW w:type="dxa" w:w="3700"/>
+            <w:tcBorders>
+              <w:top w:val="single" w:color="BBBBBB" w:sz="4"/>
+              <w:left w:val="single" w:color="BBBBBB" w:sz="4"/>
+              <w:bottom w:val="single" w:color="BBBBBB" w:sz="4"/>
+              <w:right w:val="single" w:color="BBBBBB" w:sz="4"/>
+            </w:tcBorders>
+            <w:tcMar>
+              <w:top w:type="dxa" w:w="50"/>
+              <w:left w:type="dxa" w:w="90"/>
+              <w:bottom w:type="dxa" w:w="50"/>
+              <w:right w:type="dxa" w:w="90"/>
+            </w:tcMar>
+          </w:tcPr>
+          <w:p>
+            <w:r>
+              <w:rPr>
+                <w:rFonts w:ascii="Arial" w:cs="Arial" w:eastAsia="Arial" w:hAnsi="Arial"/>
+                <w:sz w:val="19"/>
+                <w:szCs w:val="19"/>
+                <w:rtl w:val="false"/>
+              </w:rPr>
+              <w:t xml:space="preserve">Joined to the GND of both 5 V servo supplies</w:t>
             </w:r>
           </w:p>
         </w:tc>
@@ -7689,34 +7689,6 @@
         </w:trPr>
         <w:tc>
           <w:tcPr>
-            <w:tcW w:type="dxa" w:w="1900"/>
-            <w:tcBorders>
-              <w:top w:val="single" w:color="BBBBBB" w:sz="4"/>
-              <w:left w:val="single" w:color="BBBBBB" w:sz="4"/>
-              <w:bottom w:val="single" w:color="BBBBBB" w:sz="4"/>
-              <w:right w:val="single" w:color="BBBBBB" w:sz="4"/>
-            </w:tcBorders>
-            <w:tcMar>
-              <w:top w:type="dxa" w:w="50"/>
-              <w:left w:type="dxa" w:w="90"/>
-              <w:bottom w:type="dxa" w:w="50"/>
-              <w:right w:type="dxa" w:w="90"/>
-            </w:tcMar>
-          </w:tcPr>
-          <w:p>
-            <w:r>
-              <w:rPr>
-                <w:rFonts w:ascii="Arial" w:cs="Arial" w:eastAsia="Arial" w:hAnsi="Arial"/>
-                <w:sz w:val="19"/>
-                <w:szCs w:val="19"/>
-                <w:rtl w:val="false"/>
-              </w:rPr>
-              <w:t xml:space="preserve">16</w:t>
-            </w:r>
-          </w:p>
-        </w:tc>
-        <w:tc>
-          <w:tcPr>
             <w:tcW w:type="dxa" w:w="1500"/>
             <w:tcBorders>
               <w:top w:val="single" w:color="BBBBBB" w:sz="4"/>
@@ -7739,308 +7711,13 @@
                 <w:szCs w:val="19"/>
                 <w:rtl w:val="false"/>
               </w:rPr>
-              <w:t xml:space="preserve">GP12</w:t>
-            </w:r>
-          </w:p>
-        </w:tc>
-        <w:tc>
-          <w:tcPr>
-            <w:tcW w:type="dxa" w:w="2400"/>
-            <w:tcBorders>
-              <w:top w:val="single" w:color="BBBBBB" w:sz="4"/>
-              <w:left w:val="single" w:color="BBBBBB" w:sz="4"/>
-              <w:bottom w:val="single" w:color="BBBBBB" w:sz="4"/>
-              <w:right w:val="single" w:color="BBBBBB" w:sz="4"/>
-            </w:tcBorders>
-            <w:tcMar>
-              <w:top w:type="dxa" w:w="50"/>
-              <w:left w:type="dxa" w:w="90"/>
-              <w:bottom w:type="dxa" w:w="50"/>
-              <w:right w:type="dxa" w:w="90"/>
-            </w:tcMar>
-          </w:tcPr>
-          <w:p>
-            <w:r>
-              <w:rPr>
-                <w:rFonts w:ascii="Arial" w:cs="Arial" w:eastAsia="Arial" w:hAnsi="Arial"/>
-                <w:sz w:val="19"/>
-                <w:szCs w:val="19"/>
-                <w:rtl w:val="false"/>
-              </w:rPr>
-              <w:t xml:space="preserve">SIOD (SCCB data)</w:t>
-            </w:r>
-          </w:p>
-        </w:tc>
-        <w:tc>
-          <w:tcPr>
-            <w:tcW w:type="dxa" w:w="3800"/>
-            <w:tcBorders>
-              <w:top w:val="single" w:color="BBBBBB" w:sz="4"/>
-              <w:left w:val="single" w:color="BBBBBB" w:sz="4"/>
-              <w:bottom w:val="single" w:color="BBBBBB" w:sz="4"/>
-              <w:right w:val="single" w:color="BBBBBB" w:sz="4"/>
-            </w:tcBorders>
-            <w:tcMar>
-              <w:top w:type="dxa" w:w="50"/>
-              <w:left w:type="dxa" w:w="90"/>
-              <w:bottom w:type="dxa" w:w="50"/>
-              <w:right w:type="dxa" w:w="90"/>
-            </w:tcMar>
-          </w:tcPr>
-          <w:p>
-            <w:r>
-              <w:rPr>
-                <w:rFonts w:ascii="Arial" w:cs="Arial" w:eastAsia="Arial" w:hAnsi="Arial"/>
-                <w:sz w:val="19"/>
-                <w:szCs w:val="19"/>
-                <w:rtl w:val="false"/>
-              </w:rPr>
-              <w:t xml:space="preserve">4.7 kΩ pull-up to 3.3 V; I2C0 SDA</w:t>
-            </w:r>
-          </w:p>
-        </w:tc>
-      </w:tr>
-      <w:tr>
-        <w:trPr>
-          <w:cantSplit/>
-        </w:trPr>
-        <w:tc>
-          <w:tcPr>
-            <w:tcW w:type="dxa" w:w="1900"/>
-            <w:tcBorders>
-              <w:top w:val="single" w:color="BBBBBB" w:sz="4"/>
-              <w:left w:val="single" w:color="BBBBBB" w:sz="4"/>
-              <w:bottom w:val="single" w:color="BBBBBB" w:sz="4"/>
-              <w:right w:val="single" w:color="BBBBBB" w:sz="4"/>
-            </w:tcBorders>
-            <w:tcMar>
-              <w:top w:type="dxa" w:w="50"/>
-              <w:left w:type="dxa" w:w="90"/>
-              <w:bottom w:type="dxa" w:w="50"/>
-              <w:right w:type="dxa" w:w="90"/>
-            </w:tcMar>
-          </w:tcPr>
-          <w:p>
-            <w:r>
-              <w:rPr>
-                <w:rFonts w:ascii="Arial" w:cs="Arial" w:eastAsia="Arial" w:hAnsi="Arial"/>
-                <w:sz w:val="19"/>
-                <w:szCs w:val="19"/>
-                <w:rtl w:val="false"/>
-              </w:rPr>
-              <w:t xml:space="preserve">17</w:t>
-            </w:r>
-          </w:p>
-        </w:tc>
-        <w:tc>
-          <w:tcPr>
-            <w:tcW w:type="dxa" w:w="1500"/>
-            <w:tcBorders>
-              <w:top w:val="single" w:color="BBBBBB" w:sz="4"/>
-              <w:left w:val="single" w:color="BBBBBB" w:sz="4"/>
-              <w:bottom w:val="single" w:color="BBBBBB" w:sz="4"/>
-              <w:right w:val="single" w:color="BBBBBB" w:sz="4"/>
-            </w:tcBorders>
-            <w:tcMar>
-              <w:top w:type="dxa" w:w="50"/>
-              <w:left w:type="dxa" w:w="90"/>
-              <w:bottom w:type="dxa" w:w="50"/>
-              <w:right w:type="dxa" w:w="90"/>
-            </w:tcMar>
-          </w:tcPr>
-          <w:p>
-            <w:r>
-              <w:rPr>
-                <w:rFonts w:ascii="Arial" w:cs="Arial" w:eastAsia="Arial" w:hAnsi="Arial"/>
-                <w:sz w:val="19"/>
-                <w:szCs w:val="19"/>
-                <w:rtl w:val="false"/>
-              </w:rPr>
-              <w:t xml:space="preserve">GP13</w:t>
-            </w:r>
-          </w:p>
-        </w:tc>
-        <w:tc>
-          <w:tcPr>
-            <w:tcW w:type="dxa" w:w="2400"/>
-            <w:tcBorders>
-              <w:top w:val="single" w:color="BBBBBB" w:sz="4"/>
-              <w:left w:val="single" w:color="BBBBBB" w:sz="4"/>
-              <w:bottom w:val="single" w:color="BBBBBB" w:sz="4"/>
-              <w:right w:val="single" w:color="BBBBBB" w:sz="4"/>
-            </w:tcBorders>
-            <w:tcMar>
-              <w:top w:type="dxa" w:w="50"/>
-              <w:left w:type="dxa" w:w="90"/>
-              <w:bottom w:type="dxa" w:w="50"/>
-              <w:right w:type="dxa" w:w="90"/>
-            </w:tcMar>
-          </w:tcPr>
-          <w:p>
-            <w:r>
-              <w:rPr>
-                <w:rFonts w:ascii="Arial" w:cs="Arial" w:eastAsia="Arial" w:hAnsi="Arial"/>
-                <w:sz w:val="19"/>
-                <w:szCs w:val="19"/>
-                <w:rtl w:val="false"/>
-              </w:rPr>
-              <w:t xml:space="preserve">SIOC (SCCB clock)</w:t>
-            </w:r>
-          </w:p>
-        </w:tc>
-        <w:tc>
-          <w:tcPr>
-            <w:tcW w:type="dxa" w:w="3800"/>
-            <w:tcBorders>
-              <w:top w:val="single" w:color="BBBBBB" w:sz="4"/>
-              <w:left w:val="single" w:color="BBBBBB" w:sz="4"/>
-              <w:bottom w:val="single" w:color="BBBBBB" w:sz="4"/>
-              <w:right w:val="single" w:color="BBBBBB" w:sz="4"/>
-            </w:tcBorders>
-            <w:tcMar>
-              <w:top w:type="dxa" w:w="50"/>
-              <w:left w:type="dxa" w:w="90"/>
-              <w:bottom w:type="dxa" w:w="50"/>
-              <w:right w:type="dxa" w:w="90"/>
-            </w:tcMar>
-          </w:tcPr>
-          <w:p>
-            <w:r>
-              <w:rPr>
-                <w:rFonts w:ascii="Arial" w:cs="Arial" w:eastAsia="Arial" w:hAnsi="Arial"/>
-                <w:sz w:val="19"/>
-                <w:szCs w:val="19"/>
-                <w:rtl w:val="false"/>
-              </w:rPr>
-              <w:t xml:space="preserve">4.7 kΩ pull-up to 3.3 V; I2C0 SCL</w:t>
-            </w:r>
-          </w:p>
-        </w:tc>
-      </w:tr>
-      <w:tr>
-        <w:trPr>
-          <w:cantSplit/>
-        </w:trPr>
-        <w:tc>
-          <w:tcPr>
-            <w:tcW w:type="dxa" w:w="1900"/>
-            <w:tcBorders>
-              <w:top w:val="single" w:color="BBBBBB" w:sz="4"/>
-              <w:left w:val="single" w:color="BBBBBB" w:sz="4"/>
-              <w:bottom w:val="single" w:color="BBBBBB" w:sz="4"/>
-              <w:right w:val="single" w:color="BBBBBB" w:sz="4"/>
-            </w:tcBorders>
-            <w:tcMar>
-              <w:top w:type="dxa" w:w="50"/>
-              <w:left w:type="dxa" w:w="90"/>
-              <w:bottom w:type="dxa" w:w="50"/>
-              <w:right w:type="dxa" w:w="90"/>
-            </w:tcMar>
-          </w:tcPr>
-          <w:p>
-            <w:r>
-              <w:rPr>
-                <w:rFonts w:ascii="Arial" w:cs="Arial" w:eastAsia="Arial" w:hAnsi="Arial"/>
-                <w:sz w:val="19"/>
-                <w:szCs w:val="19"/>
-                <w:rtl w:val="false"/>
-              </w:rPr>
-              <w:t xml:space="preserve">19</w:t>
-            </w:r>
-          </w:p>
-        </w:tc>
-        <w:tc>
-          <w:tcPr>
-            <w:tcW w:type="dxa" w:w="1500"/>
-            <w:tcBorders>
-              <w:top w:val="single" w:color="BBBBBB" w:sz="4"/>
-              <w:left w:val="single" w:color="BBBBBB" w:sz="4"/>
-              <w:bottom w:val="single" w:color="BBBBBB" w:sz="4"/>
-              <w:right w:val="single" w:color="BBBBBB" w:sz="4"/>
-            </w:tcBorders>
-            <w:tcMar>
-              <w:top w:type="dxa" w:w="50"/>
-              <w:left w:type="dxa" w:w="90"/>
-              <w:bottom w:type="dxa" w:w="50"/>
-              <w:right w:type="dxa" w:w="90"/>
-            </w:tcMar>
-          </w:tcPr>
-          <w:p>
-            <w:r>
-              <w:rPr>
-                <w:rFonts w:ascii="Arial" w:cs="Arial" w:eastAsia="Arial" w:hAnsi="Arial"/>
-                <w:sz w:val="19"/>
-                <w:szCs w:val="19"/>
-                <w:rtl w:val="false"/>
-              </w:rPr>
-              <w:t xml:space="preserve">GP14</w:t>
-            </w:r>
-          </w:p>
-        </w:tc>
-        <w:tc>
-          <w:tcPr>
-            <w:tcW w:type="dxa" w:w="2400"/>
-            <w:tcBorders>
-              <w:top w:val="single" w:color="BBBBBB" w:sz="4"/>
-              <w:left w:val="single" w:color="BBBBBB" w:sz="4"/>
-              <w:bottom w:val="single" w:color="BBBBBB" w:sz="4"/>
-              <w:right w:val="single" w:color="BBBBBB" w:sz="4"/>
-            </w:tcBorders>
-            <w:tcMar>
-              <w:top w:type="dxa" w:w="50"/>
-              <w:left w:type="dxa" w:w="90"/>
-              <w:bottom w:type="dxa" w:w="50"/>
-              <w:right w:type="dxa" w:w="90"/>
-            </w:tcMar>
-          </w:tcPr>
-          <w:p>
-            <w:r>
-              <w:rPr>
-                <w:rFonts w:ascii="Arial" w:cs="Arial" w:eastAsia="Arial" w:hAnsi="Arial"/>
-                <w:sz w:val="19"/>
-                <w:szCs w:val="19"/>
-                <w:rtl w:val="false"/>
-              </w:rPr>
-              <w:t xml:space="preserve">RESET (active low)</w:t>
-            </w:r>
-          </w:p>
-        </w:tc>
-        <w:tc>
-          <w:tcPr>
-            <w:tcW w:type="dxa" w:w="3800"/>
-            <w:tcBorders>
-              <w:top w:val="single" w:color="BBBBBB" w:sz="4"/>
-              <w:left w:val="single" w:color="BBBBBB" w:sz="4"/>
-              <w:bottom w:val="single" w:color="BBBBBB" w:sz="4"/>
-              <w:right w:val="single" w:color="BBBBBB" w:sz="4"/>
-            </w:tcBorders>
-            <w:tcMar>
-              <w:top w:type="dxa" w:w="50"/>
-              <w:left w:type="dxa" w:w="90"/>
-              <w:bottom w:type="dxa" w:w="50"/>
-              <w:right w:type="dxa" w:w="90"/>
-            </w:tcMar>
-          </w:tcPr>
-          <w:p>
-            <w:r>
-              <w:rPr>
-                <w:rFonts w:ascii="Arial" w:cs="Arial" w:eastAsia="Arial" w:hAnsi="Arial"/>
-                <w:sz w:val="19"/>
-                <w:szCs w:val="19"/>
-                <w:rtl w:val="false"/>
-              </w:rPr>
-              <w:t xml:space="preserve"/>
-            </w:r>
-          </w:p>
-        </w:tc>
-      </w:tr>
-      <w:tr>
-        <w:trPr>
-          <w:cantSplit/>
-        </w:trPr>
-        <w:tc>
-          <w:tcPr>
-            <w:tcW w:type="dxa" w:w="1900"/>
+              <w:t xml:space="preserve">USB</w:t>
+            </w:r>
+          </w:p>
+        </w:tc>
+        <w:tc>
+          <w:tcPr>
+            <w:tcW w:type="dxa" w:w="1400"/>
             <w:tcBorders>
               <w:top w:val="single" w:color="BBBBBB" w:sz="4"/>
               <w:left w:val="single" w:color="BBBBBB" w:sz="4"/>
@@ -8068,670 +7745,57 @@
         </w:tc>
         <w:tc>
           <w:tcPr>
-            <w:tcW w:type="dxa" w:w="1500"/>
-            <w:tcBorders>
-              <w:top w:val="single" w:color="BBBBBB" w:sz="4"/>
-              <w:left w:val="single" w:color="BBBBBB" w:sz="4"/>
-              <w:bottom w:val="single" w:color="BBBBBB" w:sz="4"/>
-              <w:right w:val="single" w:color="BBBBBB" w:sz="4"/>
-            </w:tcBorders>
-            <w:tcMar>
-              <w:top w:type="dxa" w:w="50"/>
-              <w:left w:type="dxa" w:w="90"/>
-              <w:bottom w:type="dxa" w:w="50"/>
-              <w:right w:type="dxa" w:w="90"/>
-            </w:tcMar>
-          </w:tcPr>
-          <w:p>
-            <w:r>
-              <w:rPr>
-                <w:rFonts w:ascii="Arial" w:cs="Arial" w:eastAsia="Arial" w:hAnsi="Arial"/>
-                <w:sz w:val="19"/>
-                <w:szCs w:val="19"/>
-                <w:rtl w:val="false"/>
-              </w:rPr>
-              <w:t xml:space="preserve">GND</w:t>
-            </w:r>
-          </w:p>
-        </w:tc>
-        <w:tc>
-          <w:tcPr>
-            <w:tcW w:type="dxa" w:w="2400"/>
-            <w:tcBorders>
-              <w:top w:val="single" w:color="BBBBBB" w:sz="4"/>
-              <w:left w:val="single" w:color="BBBBBB" w:sz="4"/>
-              <w:bottom w:val="single" w:color="BBBBBB" w:sz="4"/>
-              <w:right w:val="single" w:color="BBBBBB" w:sz="4"/>
-            </w:tcBorders>
-            <w:tcMar>
-              <w:top w:type="dxa" w:w="50"/>
-              <w:left w:type="dxa" w:w="90"/>
-              <w:bottom w:type="dxa" w:w="50"/>
-              <w:right w:type="dxa" w:w="90"/>
-            </w:tcMar>
-          </w:tcPr>
-          <w:p>
-            <w:r>
-              <w:rPr>
-                <w:rFonts w:ascii="Arial" w:cs="Arial" w:eastAsia="Arial" w:hAnsi="Arial"/>
-                <w:sz w:val="19"/>
-                <w:szCs w:val="19"/>
-                <w:rtl w:val="false"/>
-              </w:rPr>
-              <w:t xml:space="preserve">PWDN (active high)</w:t>
-            </w:r>
-          </w:p>
-        </w:tc>
-        <w:tc>
-          <w:tcPr>
-            <w:tcW w:type="dxa" w:w="3800"/>
-            <w:tcBorders>
-              <w:top w:val="single" w:color="BBBBBB" w:sz="4"/>
-              <w:left w:val="single" w:color="BBBBBB" w:sz="4"/>
-              <w:bottom w:val="single" w:color="BBBBBB" w:sz="4"/>
-              <w:right w:val="single" w:color="BBBBBB" w:sz="4"/>
-            </w:tcBorders>
-            <w:tcMar>
-              <w:top w:type="dxa" w:w="50"/>
-              <w:left w:type="dxa" w:w="90"/>
-              <w:bottom w:type="dxa" w:w="50"/>
-              <w:right w:type="dxa" w:w="90"/>
-            </w:tcMar>
-          </w:tcPr>
-          <w:p>
-            <w:r>
-              <w:rPr>
-                <w:rFonts w:ascii="Arial" w:cs="Arial" w:eastAsia="Arial" w:hAnsi="Arial"/>
-                <w:sz w:val="19"/>
-                <w:szCs w:val="19"/>
-                <w:rtl w:val="false"/>
-              </w:rPr>
-              <w:t xml:space="preserve">Tied to GND: always on</w:t>
-            </w:r>
-          </w:p>
-        </w:tc>
-      </w:tr>
-      <w:tr>
-        <w:trPr>
-          <w:cantSplit/>
-        </w:trPr>
-        <w:tc>
-          <w:tcPr>
-            <w:tcW w:type="dxa" w:w="1900"/>
-            <w:tcBorders>
-              <w:top w:val="single" w:color="BBBBBB" w:sz="4"/>
-              <w:left w:val="single" w:color="BBBBBB" w:sz="4"/>
-              <w:bottom w:val="single" w:color="BBBBBB" w:sz="4"/>
-              <w:right w:val="single" w:color="BBBBBB" w:sz="4"/>
-            </w:tcBorders>
-            <w:tcMar>
-              <w:top w:type="dxa" w:w="50"/>
-              <w:left w:type="dxa" w:w="90"/>
-              <w:bottom w:type="dxa" w:w="50"/>
-              <w:right w:type="dxa" w:w="90"/>
-            </w:tcMar>
-          </w:tcPr>
-          <w:p>
-            <w:r>
-              <w:rPr>
-                <w:rFonts w:ascii="Arial" w:cs="Arial" w:eastAsia="Arial" w:hAnsi="Arial"/>
-                <w:sz w:val="19"/>
-                <w:szCs w:val="19"/>
-                <w:rtl w:val="false"/>
-              </w:rPr>
-              <w:t xml:space="preserve">36 / 38</w:t>
-            </w:r>
-          </w:p>
-        </w:tc>
-        <w:tc>
-          <w:tcPr>
-            <w:tcW w:type="dxa" w:w="1500"/>
-            <w:tcBorders>
-              <w:top w:val="single" w:color="BBBBBB" w:sz="4"/>
-              <w:left w:val="single" w:color="BBBBBB" w:sz="4"/>
-              <w:bottom w:val="single" w:color="BBBBBB" w:sz="4"/>
-              <w:right w:val="single" w:color="BBBBBB" w:sz="4"/>
-            </w:tcBorders>
-            <w:tcMar>
-              <w:top w:type="dxa" w:w="50"/>
-              <w:left w:type="dxa" w:w="90"/>
-              <w:bottom w:type="dxa" w:w="50"/>
-              <w:right w:type="dxa" w:w="90"/>
-            </w:tcMar>
-          </w:tcPr>
-          <w:p>
-            <w:r>
-              <w:rPr>
-                <w:rFonts w:ascii="Arial" w:cs="Arial" w:eastAsia="Arial" w:hAnsi="Arial"/>
-                <w:sz w:val="19"/>
-                <w:szCs w:val="19"/>
-                <w:rtl w:val="false"/>
-              </w:rPr>
-              <w:t xml:space="preserve">3V3(OUT) / GND</w:t>
-            </w:r>
-          </w:p>
-        </w:tc>
-        <w:tc>
-          <w:tcPr>
-            <w:tcW w:type="dxa" w:w="2400"/>
-            <w:tcBorders>
-              <w:top w:val="single" w:color="BBBBBB" w:sz="4"/>
-              <w:left w:val="single" w:color="BBBBBB" w:sz="4"/>
-              <w:bottom w:val="single" w:color="BBBBBB" w:sz="4"/>
-              <w:right w:val="single" w:color="BBBBBB" w:sz="4"/>
-            </w:tcBorders>
-            <w:tcMar>
-              <w:top w:type="dxa" w:w="50"/>
-              <w:left w:type="dxa" w:w="90"/>
-              <w:bottom w:type="dxa" w:w="50"/>
-              <w:right w:type="dxa" w:w="90"/>
-            </w:tcMar>
-          </w:tcPr>
-          <w:p>
-            <w:r>
-              <w:rPr>
-                <w:rFonts w:ascii="Arial" w:cs="Arial" w:eastAsia="Arial" w:hAnsi="Arial"/>
-                <w:sz w:val="19"/>
-                <w:szCs w:val="19"/>
-                <w:rtl w:val="false"/>
-              </w:rPr>
-              <w:t xml:space="preserve">Camera 3V3 / GND</w:t>
-            </w:r>
-          </w:p>
-        </w:tc>
-        <w:tc>
-          <w:tcPr>
-            <w:tcW w:type="dxa" w:w="3800"/>
-            <w:tcBorders>
-              <w:top w:val="single" w:color="BBBBBB" w:sz="4"/>
-              <w:left w:val="single" w:color="BBBBBB" w:sz="4"/>
-              <w:bottom w:val="single" w:color="BBBBBB" w:sz="4"/>
-              <w:right w:val="single" w:color="BBBBBB" w:sz="4"/>
-            </w:tcBorders>
-            <w:tcMar>
-              <w:top w:type="dxa" w:w="50"/>
-              <w:left w:type="dxa" w:w="90"/>
-              <w:bottom w:type="dxa" w:w="50"/>
-              <w:right w:type="dxa" w:w="90"/>
-            </w:tcMar>
-          </w:tcPr>
-          <w:p>
-            <w:r>
-              <w:rPr>
-                <w:rFonts w:ascii="Arial" w:cs="Arial" w:eastAsia="Arial" w:hAnsi="Arial"/>
-                <w:sz w:val="19"/>
-                <w:szCs w:val="19"/>
-                <w:rtl w:val="false"/>
-              </w:rPr>
-              <w:t xml:space="preserve">The camera is 3.3 V only</w:t>
-            </w:r>
-          </w:p>
-        </w:tc>
-      </w:tr>
-      <w:tr>
-        <w:trPr>
-          <w:cantSplit/>
-        </w:trPr>
-        <w:tc>
-          <w:tcPr>
-            <w:tcW w:type="dxa" w:w="1900"/>
-            <w:tcBorders>
-              <w:top w:val="single" w:color="BBBBBB" w:sz="4"/>
-              <w:left w:val="single" w:color="BBBBBB" w:sz="4"/>
-              <w:bottom w:val="single" w:color="BBBBBB" w:sz="4"/>
-              <w:right w:val="single" w:color="BBBBBB" w:sz="4"/>
-            </w:tcBorders>
-            <w:tcMar>
-              <w:top w:type="dxa" w:w="50"/>
-              <w:left w:type="dxa" w:w="90"/>
-              <w:bottom w:type="dxa" w:w="50"/>
-              <w:right w:type="dxa" w:w="90"/>
-            </w:tcMar>
-          </w:tcPr>
-          <w:p>
-            <w:r>
-              <w:rPr>
-                <w:rFonts w:ascii="Arial" w:cs="Arial" w:eastAsia="Arial" w:hAnsi="Arial"/>
-                <w:sz w:val="19"/>
-                <w:szCs w:val="19"/>
-                <w:rtl w:val="false"/>
-              </w:rPr>
-              <w:t xml:space="preserve">21</w:t>
-            </w:r>
-          </w:p>
-        </w:tc>
-        <w:tc>
-          <w:tcPr>
-            <w:tcW w:type="dxa" w:w="1500"/>
-            <w:tcBorders>
-              <w:top w:val="single" w:color="BBBBBB" w:sz="4"/>
-              <w:left w:val="single" w:color="BBBBBB" w:sz="4"/>
-              <w:bottom w:val="single" w:color="BBBBBB" w:sz="4"/>
-              <w:right w:val="single" w:color="BBBBBB" w:sz="4"/>
-            </w:tcBorders>
-            <w:tcMar>
-              <w:top w:type="dxa" w:w="50"/>
-              <w:left w:type="dxa" w:w="90"/>
-              <w:bottom w:type="dxa" w:w="50"/>
-              <w:right w:type="dxa" w:w="90"/>
-            </w:tcMar>
-          </w:tcPr>
-          <w:p>
-            <w:r>
-              <w:rPr>
-                <w:rFonts w:ascii="Arial" w:cs="Arial" w:eastAsia="Arial" w:hAnsi="Arial"/>
-                <w:sz w:val="19"/>
-                <w:szCs w:val="19"/>
-                <w:rtl w:val="false"/>
-              </w:rPr>
-              <w:t xml:space="preserve">GP16</w:t>
-            </w:r>
-          </w:p>
-        </w:tc>
-        <w:tc>
-          <w:tcPr>
-            <w:tcW w:type="dxa" w:w="2400"/>
-            <w:tcBorders>
-              <w:top w:val="single" w:color="BBBBBB" w:sz="4"/>
-              <w:left w:val="single" w:color="BBBBBB" w:sz="4"/>
-              <w:bottom w:val="single" w:color="BBBBBB" w:sz="4"/>
-              <w:right w:val="single" w:color="BBBBBB" w:sz="4"/>
-            </w:tcBorders>
-            <w:tcMar>
-              <w:top w:type="dxa" w:w="50"/>
-              <w:left w:type="dxa" w:w="90"/>
-              <w:bottom w:type="dxa" w:w="50"/>
-              <w:right w:type="dxa" w:w="90"/>
-            </w:tcMar>
-          </w:tcPr>
-          <w:p>
-            <w:r>
-              <w:rPr>
-                <w:rFonts w:ascii="Arial" w:cs="Arial" w:eastAsia="Arial" w:hAnsi="Arial"/>
-                <w:sz w:val="19"/>
-                <w:szCs w:val="19"/>
-                <w:rtl w:val="false"/>
-              </w:rPr>
-              <w:t xml:space="preserve">Pan servo signal</w:t>
-            </w:r>
-          </w:p>
-        </w:tc>
-        <w:tc>
-          <w:tcPr>
-            <w:tcW w:type="dxa" w:w="3800"/>
-            <w:tcBorders>
-              <w:top w:val="single" w:color="BBBBBB" w:sz="4"/>
-              <w:left w:val="single" w:color="BBBBBB" w:sz="4"/>
-              <w:bottom w:val="single" w:color="BBBBBB" w:sz="4"/>
-              <w:right w:val="single" w:color="BBBBBB" w:sz="4"/>
-            </w:tcBorders>
-            <w:tcMar>
-              <w:top w:type="dxa" w:w="50"/>
-              <w:left w:type="dxa" w:w="90"/>
-              <w:bottom w:type="dxa" w:w="50"/>
-              <w:right w:type="dxa" w:w="90"/>
-            </w:tcMar>
-          </w:tcPr>
-          <w:p>
-            <w:r>
-              <w:rPr>
-                <w:rFonts w:ascii="Arial" w:cs="Arial" w:eastAsia="Arial" w:hAnsi="Arial"/>
-                <w:sz w:val="19"/>
-                <w:szCs w:val="19"/>
-                <w:rtl w:val="false"/>
-              </w:rPr>
-              <w:t xml:space="preserve">Hardware PWM, 50 Hz</w:t>
-            </w:r>
-          </w:p>
-        </w:tc>
-      </w:tr>
-      <w:tr>
-        <w:trPr>
-          <w:cantSplit/>
-        </w:trPr>
-        <w:tc>
-          <w:tcPr>
-            <w:tcW w:type="dxa" w:w="1900"/>
-            <w:tcBorders>
-              <w:top w:val="single" w:color="BBBBBB" w:sz="4"/>
-              <w:left w:val="single" w:color="BBBBBB" w:sz="4"/>
-              <w:bottom w:val="single" w:color="BBBBBB" w:sz="4"/>
-              <w:right w:val="single" w:color="BBBBBB" w:sz="4"/>
-            </w:tcBorders>
-            <w:tcMar>
-              <w:top w:type="dxa" w:w="50"/>
-              <w:left w:type="dxa" w:w="90"/>
-              <w:bottom w:type="dxa" w:w="50"/>
-              <w:right w:type="dxa" w:w="90"/>
-            </w:tcMar>
-          </w:tcPr>
-          <w:p>
-            <w:r>
-              <w:rPr>
-                <w:rFonts w:ascii="Arial" w:cs="Arial" w:eastAsia="Arial" w:hAnsi="Arial"/>
-                <w:sz w:val="19"/>
-                <w:szCs w:val="19"/>
-                <w:rtl w:val="false"/>
-              </w:rPr>
-              <w:t xml:space="preserve">22</w:t>
-            </w:r>
-          </w:p>
-        </w:tc>
-        <w:tc>
-          <w:tcPr>
-            <w:tcW w:type="dxa" w:w="1500"/>
-            <w:tcBorders>
-              <w:top w:val="single" w:color="BBBBBB" w:sz="4"/>
-              <w:left w:val="single" w:color="BBBBBB" w:sz="4"/>
-              <w:bottom w:val="single" w:color="BBBBBB" w:sz="4"/>
-              <w:right w:val="single" w:color="BBBBBB" w:sz="4"/>
-            </w:tcBorders>
-            <w:tcMar>
-              <w:top w:type="dxa" w:w="50"/>
-              <w:left w:type="dxa" w:w="90"/>
-              <w:bottom w:type="dxa" w:w="50"/>
-              <w:right w:type="dxa" w:w="90"/>
-            </w:tcMar>
-          </w:tcPr>
-          <w:p>
-            <w:r>
-              <w:rPr>
-                <w:rFonts w:ascii="Arial" w:cs="Arial" w:eastAsia="Arial" w:hAnsi="Arial"/>
-                <w:sz w:val="19"/>
-                <w:szCs w:val="19"/>
-                <w:rtl w:val="false"/>
-              </w:rPr>
-              <w:t xml:space="preserve">GP17</w:t>
-            </w:r>
-          </w:p>
-        </w:tc>
-        <w:tc>
-          <w:tcPr>
-            <w:tcW w:type="dxa" w:w="2400"/>
-            <w:tcBorders>
-              <w:top w:val="single" w:color="BBBBBB" w:sz="4"/>
-              <w:left w:val="single" w:color="BBBBBB" w:sz="4"/>
-              <w:bottom w:val="single" w:color="BBBBBB" w:sz="4"/>
-              <w:right w:val="single" w:color="BBBBBB" w:sz="4"/>
-            </w:tcBorders>
-            <w:tcMar>
-              <w:top w:type="dxa" w:w="50"/>
-              <w:left w:type="dxa" w:w="90"/>
-              <w:bottom w:type="dxa" w:w="50"/>
-              <w:right w:type="dxa" w:w="90"/>
-            </w:tcMar>
-          </w:tcPr>
-          <w:p>
-            <w:r>
-              <w:rPr>
-                <w:rFonts w:ascii="Arial" w:cs="Arial" w:eastAsia="Arial" w:hAnsi="Arial"/>
-                <w:sz w:val="19"/>
-                <w:szCs w:val="19"/>
-                <w:rtl w:val="false"/>
-              </w:rPr>
-              <w:t xml:space="preserve">Tilt servo signal</w:t>
-            </w:r>
-          </w:p>
-        </w:tc>
-        <w:tc>
-          <w:tcPr>
-            <w:tcW w:type="dxa" w:w="3800"/>
-            <w:tcBorders>
-              <w:top w:val="single" w:color="BBBBBB" w:sz="4"/>
-              <w:left w:val="single" w:color="BBBBBB" w:sz="4"/>
-              <w:bottom w:val="single" w:color="BBBBBB" w:sz="4"/>
-              <w:right w:val="single" w:color="BBBBBB" w:sz="4"/>
-            </w:tcBorders>
-            <w:tcMar>
-              <w:top w:type="dxa" w:w="50"/>
-              <w:left w:type="dxa" w:w="90"/>
-              <w:bottom w:type="dxa" w:w="50"/>
-              <w:right w:type="dxa" w:w="90"/>
-            </w:tcMar>
-          </w:tcPr>
-          <w:p>
-            <w:r>
-              <w:rPr>
-                <w:rFonts w:ascii="Arial" w:cs="Arial" w:eastAsia="Arial" w:hAnsi="Arial"/>
-                <w:sz w:val="19"/>
-                <w:szCs w:val="19"/>
-                <w:rtl w:val="false"/>
-              </w:rPr>
-              <w:t xml:space="preserve">Hardware PWM, 50 Hz</w:t>
-            </w:r>
-          </w:p>
-        </w:tc>
-      </w:tr>
-      <w:tr>
-        <w:trPr>
-          <w:cantSplit/>
-        </w:trPr>
-        <w:tc>
-          <w:tcPr>
-            <w:tcW w:type="dxa" w:w="1900"/>
-            <w:tcBorders>
-              <w:top w:val="single" w:color="BBBBBB" w:sz="4"/>
-              <w:left w:val="single" w:color="BBBBBB" w:sz="4"/>
-              <w:bottom w:val="single" w:color="BBBBBB" w:sz="4"/>
-              <w:right w:val="single" w:color="BBBBBB" w:sz="4"/>
-            </w:tcBorders>
-            <w:tcMar>
-              <w:top w:type="dxa" w:w="50"/>
-              <w:left w:type="dxa" w:w="90"/>
-              <w:bottom w:type="dxa" w:w="50"/>
-              <w:right w:type="dxa" w:w="90"/>
-            </w:tcMar>
-          </w:tcPr>
-          <w:p>
-            <w:r>
-              <w:rPr>
-                <w:rFonts w:ascii="Arial" w:cs="Arial" w:eastAsia="Arial" w:hAnsi="Arial"/>
-                <w:sz w:val="19"/>
-                <w:szCs w:val="19"/>
-                <w:rtl w:val="false"/>
-              </w:rPr>
-              <w:t xml:space="preserve">24</w:t>
-            </w:r>
-          </w:p>
-        </w:tc>
-        <w:tc>
-          <w:tcPr>
-            <w:tcW w:type="dxa" w:w="1500"/>
-            <w:tcBorders>
-              <w:top w:val="single" w:color="BBBBBB" w:sz="4"/>
-              <w:left w:val="single" w:color="BBBBBB" w:sz="4"/>
-              <w:bottom w:val="single" w:color="BBBBBB" w:sz="4"/>
-              <w:right w:val="single" w:color="BBBBBB" w:sz="4"/>
-            </w:tcBorders>
-            <w:tcMar>
-              <w:top w:type="dxa" w:w="50"/>
-              <w:left w:type="dxa" w:w="90"/>
-              <w:bottom w:type="dxa" w:w="50"/>
-              <w:right w:type="dxa" w:w="90"/>
-            </w:tcMar>
-          </w:tcPr>
-          <w:p>
-            <w:r>
-              <w:rPr>
-                <w:rFonts w:ascii="Arial" w:cs="Arial" w:eastAsia="Arial" w:hAnsi="Arial"/>
-                <w:sz w:val="19"/>
-                <w:szCs w:val="19"/>
-                <w:rtl w:val="false"/>
-              </w:rPr>
-              <w:t xml:space="preserve">GP18</w:t>
-            </w:r>
-          </w:p>
-        </w:tc>
-        <w:tc>
-          <w:tcPr>
-            <w:tcW w:type="dxa" w:w="2400"/>
-            <w:tcBorders>
-              <w:top w:val="single" w:color="BBBBBB" w:sz="4"/>
-              <w:left w:val="single" w:color="BBBBBB" w:sz="4"/>
-              <w:bottom w:val="single" w:color="BBBBBB" w:sz="4"/>
-              <w:right w:val="single" w:color="BBBBBB" w:sz="4"/>
-            </w:tcBorders>
-            <w:tcMar>
-              <w:top w:type="dxa" w:w="50"/>
-              <w:left w:type="dxa" w:w="90"/>
-              <w:bottom w:type="dxa" w:w="50"/>
-              <w:right w:type="dxa" w:w="90"/>
-            </w:tcMar>
-          </w:tcPr>
-          <w:p>
-            <w:r>
-              <w:rPr>
-                <w:rFonts w:ascii="Arial" w:cs="Arial" w:eastAsia="Arial" w:hAnsi="Arial"/>
-                <w:sz w:val="19"/>
-                <w:szCs w:val="19"/>
-                <w:rtl w:val="false"/>
-              </w:rPr>
-              <w:t xml:space="preserve">Laser enable</w:t>
-            </w:r>
-          </w:p>
-        </w:tc>
-        <w:tc>
-          <w:tcPr>
-            <w:tcW w:type="dxa" w:w="3800"/>
-            <w:tcBorders>
-              <w:top w:val="single" w:color="BBBBBB" w:sz="4"/>
-              <w:left w:val="single" w:color="BBBBBB" w:sz="4"/>
-              <w:bottom w:val="single" w:color="BBBBBB" w:sz="4"/>
-              <w:right w:val="single" w:color="BBBBBB" w:sz="4"/>
-            </w:tcBorders>
-            <w:tcMar>
-              <w:top w:type="dxa" w:w="50"/>
-              <w:left w:type="dxa" w:w="90"/>
-              <w:bottom w:type="dxa" w:w="50"/>
-              <w:right w:type="dxa" w:w="90"/>
-            </w:tcMar>
-          </w:tcPr>
-          <w:p>
-            <w:r>
-              <w:rPr>
-                <w:rFonts w:ascii="Arial" w:cs="Arial" w:eastAsia="Arial" w:hAnsi="Arial"/>
-                <w:sz w:val="19"/>
-                <w:szCs w:val="19"/>
-                <w:rtl w:val="false"/>
-              </w:rPr>
-              <w:t xml:space="preserve">1 kΩ to the base of an NPN (2N2222/S8050); laser (−) to collector, (+) to 5 V</w:t>
-            </w:r>
-          </w:p>
-        </w:tc>
-      </w:tr>
-      <w:tr>
-        <w:trPr>
-          <w:cantSplit/>
-        </w:trPr>
-        <w:tc>
-          <w:tcPr>
-            <w:tcW w:type="dxa" w:w="1900"/>
-            <w:tcBorders>
-              <w:top w:val="single" w:color="BBBBBB" w:sz="4"/>
-              <w:left w:val="single" w:color="BBBBBB" w:sz="4"/>
-              <w:bottom w:val="single" w:color="BBBBBB" w:sz="4"/>
-              <w:right w:val="single" w:color="BBBBBB" w:sz="4"/>
-            </w:tcBorders>
-            <w:tcMar>
-              <w:top w:type="dxa" w:w="50"/>
-              <w:left w:type="dxa" w:w="90"/>
-              <w:bottom w:type="dxa" w:w="50"/>
-              <w:right w:type="dxa" w:w="90"/>
-            </w:tcMar>
-          </w:tcPr>
-          <w:p>
-            <w:r>
-              <w:rPr>
-                <w:rFonts w:ascii="Arial" w:cs="Arial" w:eastAsia="Arial" w:hAnsi="Arial"/>
-                <w:sz w:val="19"/>
-                <w:szCs w:val="19"/>
-                <w:rtl w:val="false"/>
-              </w:rPr>
-              <w:t xml:space="preserve">23</w:t>
-            </w:r>
-          </w:p>
-        </w:tc>
-        <w:tc>
-          <w:tcPr>
-            <w:tcW w:type="dxa" w:w="1500"/>
-            <w:tcBorders>
-              <w:top w:val="single" w:color="BBBBBB" w:sz="4"/>
-              <w:left w:val="single" w:color="BBBBBB" w:sz="4"/>
-              <w:bottom w:val="single" w:color="BBBBBB" w:sz="4"/>
-              <w:right w:val="single" w:color="BBBBBB" w:sz="4"/>
-            </w:tcBorders>
-            <w:tcMar>
-              <w:top w:type="dxa" w:w="50"/>
-              <w:left w:type="dxa" w:w="90"/>
-              <w:bottom w:type="dxa" w:w="50"/>
-              <w:right w:type="dxa" w:w="90"/>
-            </w:tcMar>
-          </w:tcPr>
-          <w:p>
-            <w:r>
-              <w:rPr>
-                <w:rFonts w:ascii="Arial" w:cs="Arial" w:eastAsia="Arial" w:hAnsi="Arial"/>
-                <w:sz w:val="19"/>
-                <w:szCs w:val="19"/>
-                <w:rtl w:val="false"/>
-              </w:rPr>
-              <w:t xml:space="preserve">GND</w:t>
-            </w:r>
-          </w:p>
-        </w:tc>
-        <w:tc>
-          <w:tcPr>
-            <w:tcW w:type="dxa" w:w="2400"/>
-            <w:tcBorders>
-              <w:top w:val="single" w:color="BBBBBB" w:sz="4"/>
-              <w:left w:val="single" w:color="BBBBBB" w:sz="4"/>
-              <w:bottom w:val="single" w:color="BBBBBB" w:sz="4"/>
-              <w:right w:val="single" w:color="BBBBBB" w:sz="4"/>
-            </w:tcBorders>
-            <w:tcMar>
-              <w:top w:type="dxa" w:w="50"/>
-              <w:left w:type="dxa" w:w="90"/>
-              <w:bottom w:type="dxa" w:w="50"/>
-              <w:right w:type="dxa" w:w="90"/>
-            </w:tcMar>
-          </w:tcPr>
-          <w:p>
-            <w:r>
-              <w:rPr>
-                <w:rFonts w:ascii="Arial" w:cs="Arial" w:eastAsia="Arial" w:hAnsi="Arial"/>
-                <w:sz w:val="19"/>
-                <w:szCs w:val="19"/>
-                <w:rtl w:val="false"/>
-              </w:rPr>
-              <w:t xml:space="preserve">Common ground</w:t>
-            </w:r>
-          </w:p>
-        </w:tc>
-        <w:tc>
-          <w:tcPr>
-            <w:tcW w:type="dxa" w:w="3800"/>
-            <w:tcBorders>
-              <w:top w:val="single" w:color="BBBBBB" w:sz="4"/>
-              <w:left w:val="single" w:color="BBBBBB" w:sz="4"/>
-              <w:bottom w:val="single" w:color="BBBBBB" w:sz="4"/>
-              <w:right w:val="single" w:color="BBBBBB" w:sz="4"/>
-            </w:tcBorders>
-            <w:tcMar>
-              <w:top w:type="dxa" w:w="50"/>
-              <w:left w:type="dxa" w:w="90"/>
-              <w:bottom w:type="dxa" w:w="50"/>
-              <w:right w:type="dxa" w:w="90"/>
-            </w:tcMar>
-          </w:tcPr>
-          <w:p>
-            <w:r>
-              <w:rPr>
-                <w:rFonts w:ascii="Arial" w:cs="Arial" w:eastAsia="Arial" w:hAnsi="Arial"/>
-                <w:sz w:val="19"/>
-                <w:szCs w:val="19"/>
-                <w:rtl w:val="false"/>
-              </w:rPr>
-              <w:t xml:space="preserve">Joined to the GND of the 5 V servo supply</w:t>
+            <w:tcW w:type="dxa" w:w="3000"/>
+            <w:tcBorders>
+              <w:top w:val="single" w:color="BBBBBB" w:sz="4"/>
+              <w:left w:val="single" w:color="BBBBBB" w:sz="4"/>
+              <w:bottom w:val="single" w:color="BBBBBB" w:sz="4"/>
+              <w:right w:val="single" w:color="BBBBBB" w:sz="4"/>
+            </w:tcBorders>
+            <w:tcMar>
+              <w:top w:type="dxa" w:w="50"/>
+              <w:left w:type="dxa" w:w="90"/>
+              <w:bottom w:type="dxa" w:w="50"/>
+              <w:right w:type="dxa" w:w="90"/>
+            </w:tcMar>
+          </w:tcPr>
+          <w:p>
+            <w:r>
+              <w:rPr>
+                <w:rFonts w:ascii="Arial" w:cs="Arial" w:eastAsia="Arial" w:hAnsi="Arial"/>
+                <w:sz w:val="19"/>
+                <w:szCs w:val="19"/>
+                <w:rtl w:val="false"/>
+              </w:rPr>
+              <w:t xml:space="preserve">Data and power from the Raspberry Pi</w:t>
+            </w:r>
+          </w:p>
+        </w:tc>
+        <w:tc>
+          <w:tcPr>
+            <w:tcW w:type="dxa" w:w="3700"/>
+            <w:tcBorders>
+              <w:top w:val="single" w:color="BBBBBB" w:sz="4"/>
+              <w:left w:val="single" w:color="BBBBBB" w:sz="4"/>
+              <w:bottom w:val="single" w:color="BBBBBB" w:sz="4"/>
+              <w:right w:val="single" w:color="BBBBBB" w:sz="4"/>
+            </w:tcBorders>
+            <w:tcMar>
+              <w:top w:type="dxa" w:w="50"/>
+              <w:left w:type="dxa" w:w="90"/>
+              <w:bottom w:type="dxa" w:w="50"/>
+              <w:right w:type="dxa" w:w="90"/>
+            </w:tcMar>
+          </w:tcPr>
+          <w:p>
+            <w:r>
+              <w:rPr>
+                <w:rFonts w:ascii="Arial" w:cs="Arial" w:eastAsia="Arial" w:hAnsi="Arial"/>
+                <w:sz w:val="19"/>
+                <w:szCs w:val="19"/>
+                <w:rtl w:val="false"/>
+              </w:rPr>
+              <w:t xml:space="preserve">Product string "DroneLoc Pointer"</w:t>
             </w:r>
           </w:p>
         </w:tc>
@@ -8760,7 +7824,7 @@
           <w:rFonts w:ascii="Arial" w:cs="Arial" w:eastAsia="Arial" w:hAnsi="Arial"/>
           <w:rtl w:val="false"/>
         </w:rPr>
-        <w:t xml:space="preserve">servos and laser from a separate 5 V / 5 A supply with a 1000 µF capacitor across it (two MG995 can draw 2–3 A each when starting or stalled); never from the Pico or the Raspberry Pi. Camera wires shorter than 15 cm (PCLK, XCLK, D0–D7). Connect camera pins by the names printed on the board: the physical order varies between makers.</w:t>
+        <w:t xml:space="preserve">each head has its own 5 V / 5 A supply with a 1000 µF capacitor (an MG995 can draw 2–2.5 A when starting or stalled); thick power wires; never power servos from the Pico or the Raspberry Pi. Servo wire colours: signal orange, +5 V red, GND brown.</w:t>
       </w:r>
     </w:p>
     <w:p>
@@ -8772,7 +7836,7 @@
           <w:rFonts w:ascii="Arial" w:cs="Arial" w:eastAsia="Arial" w:hAnsi="Arial"/>
           <w:rtl w:val="false"/>
         </w:rPr>
-        <w:t xml:space="preserve">MG995 servos (chosen by the user because of the camera and laser weight)</w:t>
+        <w:t xml:space="preserve">MG995 servos (chosen by the user because of the camera weight)</w:t>
       </w:r>
     </w:p>
     <w:tbl>
@@ -8974,7 +8038,7 @@
                 <w:szCs w:val="19"/>
                 <w:rtl w:val="false"/>
               </w:rPr>
-              <w:t xml:space="preserve">Run at 5 V together with the laser (one 5 V / 5 A supply)</w:t>
+              <w:t xml:space="preserve">Run at 5 V</w:t>
             </w:r>
           </w:p>
         </w:tc>
@@ -9063,7 +8127,7 @@
                 <w:szCs w:val="19"/>
                 <w:rtl w:val="false"/>
               </w:rPr>
-              <w:t xml:space="preserve">Plenty for a small camera and laser</w:t>
+              <w:t xml:space="preserve">Plenty for one webcam per head</w:t>
             </w:r>
           </w:p>
         </w:tc>
@@ -9152,7 +8216,7 @@
                 <w:szCs w:val="19"/>
                 <w:rtl w:val="false"/>
               </w:rPr>
-              <w:t xml:space="preserve">5 A supply, 1000 µF capacitor, thick power wires</w:t>
+              <w:t xml:space="preserve">5 V / 5 A per head, 1000 µF capacitor</w:t>
             </w:r>
           </w:p>
         </w:tc>
@@ -9330,7 +8394,7 @@
                 <w:szCs w:val="19"/>
                 <w:rtl w:val="false"/>
               </w:rPr>
-              <w:t xml:space="preserve">Standard-size bracket, not the SG90/MG90S kit</w:t>
+              <w:t xml:space="preserve">Metal bracket for standard-size servos</w:t>
             </w:r>
           </w:p>
         </w:tc>
@@ -9528,7 +8592,7 @@
           <w:rFonts w:ascii="Arial" w:cs="Arial" w:eastAsia="Arial" w:hAnsi="Arial"/>
           <w:rtl w:val="false"/>
         </w:rPr>
-        <w:t xml:space="preserve">6.2 Firmware to write (hardware/pico_pointer/)</w:t>
+        <w:t xml:space="preserve">6.2 Pico 2 firmware to write (hardware/pico_pointer/)</w:t>
       </w:r>
     </w:p>
     <w:p>
@@ -9559,7 +8623,21 @@
           <w:rFonts w:ascii="Arial" w:cs="Arial" w:eastAsia="Arial" w:hAnsi="Arial"/>
           <w:rtl w:val="false"/>
         </w:rPr>
-        <w:t xml:space="preserve">.</w:t>
+        <w:t xml:space="preserve"> (so </w:t>
+      </w:r>
+      <w:r>
+        <w:rPr>
+          <w:rFonts w:ascii="Consolas" w:cs="Consolas" w:eastAsia="Consolas" w:hAnsi="Consolas"/>
+          <w:rtl w:val="false"/>
+        </w:rPr>
+        <w:t xml:space="preserve">find_port()</w:t>
+      </w:r>
+      <w:r>
+        <w:rPr>
+          <w:rFonts w:ascii="Arial" w:cs="Arial" w:eastAsia="Arial" w:hAnsi="Arial"/>
+          <w:rtl w:val="false"/>
+        </w:rPr>
+        <w:t xml:space="preserve"> never confuses it with the microphone Pico).</w:t>
       </w:r>
     </w:p>
     <w:p>
@@ -9576,7 +8654,7 @@
           <w:rFonts w:ascii="Arial" w:cs="Arial" w:eastAsia="Arial" w:hAnsi="Arial"/>
           <w:rtl w:val="false"/>
         </w:rPr>
-        <w:t xml:space="preserve">Camera: XCLK from GPOUT0 on GP21 (e.g. ~12 MHz); configure over SCCB (I2C, 7-bit address 0x21) using a known-good OV7670 register table from an open-source project, QQVGA 160x120 YUV422; a PIO program waits for VSYNC/HREF and samples D0–D7 on rising PCLK; DMA into a frame buffer; keep only the Y bytes (grayscale, 19.2 kB per frame).</w:t>
+        <w:t xml:space="preserve">Four hardware PWM outputs at 50 Hz on GP16–GP19; pulse width from a per-servo calibration (end points in µs for 0° and 180°).</w:t>
       </w:r>
     </w:p>
     <w:p>
@@ -9593,21 +8671,49 @@
           <w:rFonts w:ascii="Arial" w:cs="Arial" w:eastAsia="Arial" w:hAnsi="Arial"/>
           <w:rtl w:val="false"/>
         </w:rPr>
-        <w:t xml:space="preserve">Frame packets to the host, e.g. </w:t>
+        <w:t xml:space="preserve">Text commands, one per line, e.g. </w:t>
       </w:r>
       <w:r>
         <w:rPr>
           <w:rFonts w:ascii="Consolas" w:cs="Consolas" w:eastAsia="Consolas" w:hAnsi="Consolas"/>
           <w:rtl w:val="false"/>
         </w:rPr>
-        <w:t xml:space="preserve">"CAMF" | u32 seq | u16 w | u16 h | u8 format | data | u16 checksum</w:t>
-      </w:r>
-      <w:r>
-        <w:rPr>
-          <w:rFonts w:ascii="Arial" w:cs="Arial" w:eastAsia="Arial" w:hAnsi="Arial"/>
-          <w:rtl w:val="false"/>
-        </w:rPr>
-        <w:t xml:space="preserve">, resynchronising on the magic like the audio packets.</w:t>
+        <w:t xml:space="preserve">H &lt;head U|L&gt; &lt;pan_deg&gt; &lt;tilt_deg&gt;</w:t>
+      </w:r>
+      <w:r>
+        <w:rPr>
+          <w:rFonts w:ascii="Arial" w:cs="Arial" w:eastAsia="Arial" w:hAnsi="Arial"/>
+          <w:rtl w:val="false"/>
+        </w:rPr>
+        <w:t xml:space="preserve">, </w:t>
+      </w:r>
+      <w:r>
+        <w:rPr>
+          <w:rFonts w:ascii="Consolas" w:cs="Consolas" w:eastAsia="Consolas" w:hAnsi="Consolas"/>
+          <w:rtl w:val="false"/>
+        </w:rPr>
+        <w:t xml:space="preserve">X &lt;head&gt;</w:t>
+      </w:r>
+      <w:r>
+        <w:rPr>
+          <w:rFonts w:ascii="Arial" w:cs="Arial" w:eastAsia="Arial" w:hAnsi="Arial"/>
+          <w:rtl w:val="false"/>
+        </w:rPr>
+        <w:t xml:space="preserve"> (release: stop the pulses so the servo goes limp), </w:t>
+      </w:r>
+      <w:r>
+        <w:rPr>
+          <w:rFonts w:ascii="Consolas" w:cs="Consolas" w:eastAsia="Consolas" w:hAnsi="Consolas"/>
+          <w:rtl w:val="false"/>
+        </w:rPr>
+        <w:t xml:space="preserve">?</w:t>
+      </w:r>
+      <w:r>
+        <w:rPr>
+          <w:rFonts w:ascii="Arial" w:cs="Arial" w:eastAsia="Arial" w:hAnsi="Arial"/>
+          <w:rtl w:val="false"/>
+        </w:rPr>
+        <w:t xml:space="preserve"> (status). Reply with one line per command.</w:t>
       </w:r>
     </w:p>
     <w:p>
@@ -9624,49 +8730,7 @@
           <w:rFonts w:ascii="Arial" w:cs="Arial" w:eastAsia="Arial" w:hAnsi="Arial"/>
           <w:rtl w:val="false"/>
         </w:rPr>
-        <w:t xml:space="preserve">Commands from the host as text lines, e.g. </w:t>
-      </w:r>
-      <w:r>
-        <w:rPr>
-          <w:rFonts w:ascii="Consolas" w:cs="Consolas" w:eastAsia="Consolas" w:hAnsi="Consolas"/>
-          <w:rtl w:val="false"/>
-        </w:rPr>
-        <w:t xml:space="preserve">P &lt;pan_deg&gt; &lt;tilt_deg&gt;</w:t>
-      </w:r>
-      <w:r>
-        <w:rPr>
-          <w:rFonts w:ascii="Arial" w:cs="Arial" w:eastAsia="Arial" w:hAnsi="Arial"/>
-          <w:rtl w:val="false"/>
-        </w:rPr>
-        <w:t xml:space="preserve">, </w:t>
-      </w:r>
-      <w:r>
-        <w:rPr>
-          <w:rFonts w:ascii="Consolas" w:cs="Consolas" w:eastAsia="Consolas" w:hAnsi="Consolas"/>
-          <w:rtl w:val="false"/>
-        </w:rPr>
-        <w:t xml:space="preserve">L 0|1</w:t>
-      </w:r>
-      <w:r>
-        <w:rPr>
-          <w:rFonts w:ascii="Arial" w:cs="Arial" w:eastAsia="Arial" w:hAnsi="Arial"/>
-          <w:rtl w:val="false"/>
-        </w:rPr>
-        <w:t xml:space="preserve"> (laser), </w:t>
-      </w:r>
-      <w:r>
-        <w:rPr>
-          <w:rFonts w:ascii="Consolas" w:cs="Consolas" w:eastAsia="Consolas" w:hAnsi="Consolas"/>
-          <w:rtl w:val="false"/>
-        </w:rPr>
-        <w:t xml:space="preserve">?</w:t>
-      </w:r>
-      <w:r>
-        <w:rPr>
-          <w:rFonts w:ascii="Arial" w:cs="Arial" w:eastAsia="Arial" w:hAnsi="Arial"/>
-          <w:rtl w:val="false"/>
-        </w:rPr>
-        <w:t xml:space="preserve"> (status). Reply in a separate packet type so binary frames and replies do not mix.</w:t>
+        <w:t xml:space="preserve">Slew-rate limit inside the firmware; release all servos if no command arrived for a few seconds (safe default).</w:t>
       </w:r>
     </w:p>
     <w:p>
@@ -9683,7 +8747,7 @@
           <w:rFonts w:ascii="Arial" w:cs="Arial" w:eastAsia="Arial" w:hAnsi="Arial"/>
           <w:rtl w:val="false"/>
         </w:rPr>
-        <w:t xml:space="preserve">Servos: hardware PWM 50 Hz, pulse about 500–2500 µs for 0–180° (calibrate the end points per servo); limit the slew rate; laser off at start-up and whenever no command arrived for a few seconds.</w:t>
+        <w:t xml:space="preserve">No camera code on the Pico: the cameras are USB devices on the Raspberry Pi.</w:t>
       </w:r>
     </w:p>
     <w:p>
@@ -9695,7 +8759,7 @@
           <w:rFonts w:ascii="Arial" w:cs="Arial" w:eastAsia="Arial" w:hAnsi="Arial"/>
           <w:rtl w:val="false"/>
         </w:rPr>
-        <w:t xml:space="preserve">6.3 Covering the upper hemisphere with two 180° servos</w:t>
+        <w:t xml:space="preserve">6.3 Directions to servo angles, and which head moves</w:t>
       </w:r>
     </w:p>
     <w:p>
@@ -9707,7 +8771,7 @@
           <w:rFonts w:ascii="Arial" w:cs="Arial" w:eastAsia="Arial" w:hAnsi="Arial"/>
           <w:rtl w:val="false"/>
         </w:rPr>
-        <w:t xml:space="preserve">Pan 0° points along the array +x axis; tilt 0° is horizontal along the pan direction, 90° straight up, 180° horizontal in the opposite direction. With azimuth az taken in [0°, 360°) and elevation el in [0°, 90°]:</w:t>
+        <w:t xml:space="preserve">Array frame: x forward, y left, z up; azimuth az = atan2(y, x) taken in [0°, 360°), elevation el in [−90°, 90°]. Pan 0° points along +x; tilt 0° is horizontal along the pan direction, 90° straight up (straight down for the lower head), 180° horizontal in the opposite direction.</w:t>
       </w:r>
     </w:p>
     <w:p>
@@ -9724,7 +8788,7 @@
           <w:rFonts w:ascii="Arial" w:cs="Arial" w:eastAsia="Arial" w:hAnsi="Arial"/>
           <w:rtl w:val="false"/>
         </w:rPr>
-        <w:t xml:space="preserve">az in [0°, 180°): pan = az, tilt = el</w:t>
+        <w:t xml:space="preserve">Upper head (el ≥ 0): az in [0°, 180°): pan = az, tilt = el; az in [180°, 360°): pan = az − 180°, tilt = 180° − el (the tilt servo leans back over the top).</w:t>
       </w:r>
     </w:p>
     <w:p>
@@ -9741,7 +8805,24 @@
           <w:rFonts w:ascii="Arial" w:cs="Arial" w:eastAsia="Arial" w:hAnsi="Arial"/>
           <w:rtl w:val="false"/>
         </w:rPr>
-        <w:t xml:space="preserve">az in [180°, 360°): pan = az − 180°, tilt = 180° − el (the tilt servo leans back over the top)</w:t>
+        <w:t xml:space="preserve">Lower head (mounted upside down, i.e. rotated 180° about the x axis): az′ = −az (mod 360), el′ = −el, then the same rule with az′, el′. The calibration decides the real signs and offsets.</w:t>
+      </w:r>
+    </w:p>
+    <w:p>
+      <w:pPr>
+        <w:pStyle w:val="ListParagraph"/>
+        <w:numPr>
+          <w:ilvl w:val="0"/>
+          <w:numId w:val="3"/>
+        </w:numPr>
+        <w:spacing w:after="60" w:line="276"/>
+      </w:pPr>
+      <w:r>
+        <w:rPr>
+          <w:rFonts w:ascii="Arial" w:cs="Arial" w:eastAsia="Arial" w:hAnsi="Arial"/>
+          <w:rtl w:val="false"/>
+        </w:rPr>
+        <w:t xml:space="preserve">Head selection with hysteresis: el &gt; +5° → upper head, el &lt; −5° → lower head, in between keep the head in use; park (or release) the idle head.</w:t>
       </w:r>
     </w:p>
     <w:p>
@@ -9767,7 +8848,7 @@
           <w:rFonts w:ascii="Arial" w:cs="Arial" w:eastAsia="Arial" w:hAnsi="Arial"/>
           <w:rtl w:val="false"/>
         </w:rPr>
-        <w:t xml:space="preserve">. Directions below the horizon cannot be reached; clamp el at 0°.</w:t>
+        <w:t xml:space="preserve">. Each head gets its own calibration (zero offsets and the rotation between the array frame and the head frame), stored in a small JSON file.</w:t>
       </w:r>
     </w:p>
     <w:p>
@@ -9779,7 +8860,188 @@
           <w:rFonts w:ascii="Arial" w:cs="Arial" w:eastAsia="Arial" w:hAnsi="Arial"/>
           <w:rtl w:val="false"/>
         </w:rPr>
-        <w:t xml:space="preserve">6.4 Host side to write</w:t>
+        <w:t xml:space="preserve">6.4 The cameras: two Logitech Brio 100 (USB, on the Raspberry Pi)</w:t>
+      </w:r>
+    </w:p>
+    <w:p>
+      <w:pPr>
+        <w:pStyle w:val="ListParagraph"/>
+        <w:numPr>
+          <w:ilvl w:val="0"/>
+          <w:numId w:val="3"/>
+        </w:numPr>
+        <w:spacing w:after="60" w:line="276"/>
+      </w:pPr>
+      <w:r>
+        <w:rPr>
+          <w:rFonts w:ascii="Arial" w:cs="Arial" w:eastAsia="Arial" w:hAnsi="Arial"/>
+          <w:rtl w:val="false"/>
+        </w:rPr>
+        <w:t xml:space="preserve">Standard UVC webcams, Full HD 1080p. Connect them to the two blue USB 3 ports of the Pi; the two Picos go on the black USB 2 ports. They appear as </w:t>
+      </w:r>
+      <w:r>
+        <w:rPr>
+          <w:rFonts w:ascii="Consolas" w:cs="Consolas" w:eastAsia="Consolas" w:hAnsi="Consolas"/>
+          <w:rtl w:val="false"/>
+        </w:rPr>
+        <w:t xml:space="preserve">/dev/video*</w:t>
+      </w:r>
+      <w:r>
+        <w:rPr>
+          <w:rFonts w:ascii="Arial" w:cs="Arial" w:eastAsia="Arial" w:hAnsi="Arial"/>
+          <w:rtl w:val="false"/>
+        </w:rPr>
+        <w:t xml:space="preserve">; identify each camera by </w:t>
+      </w:r>
+      <w:r>
+        <w:rPr>
+          <w:rFonts w:ascii="Consolas" w:cs="Consolas" w:eastAsia="Consolas" w:hAnsi="Consolas"/>
+          <w:rtl w:val="false"/>
+        </w:rPr>
+        <w:t xml:space="preserve">/dev/v4l/by-id/</w:t>
+      </w:r>
+      <w:r>
+        <w:rPr>
+          <w:rFonts w:ascii="Arial" w:cs="Arial" w:eastAsia="Arial" w:hAnsi="Arial"/>
+          <w:rtl w:val="false"/>
+        </w:rPr>
+        <w:t xml:space="preserve"> (serial number) or by its USB port path in </w:t>
+      </w:r>
+      <w:r>
+        <w:rPr>
+          <w:rFonts w:ascii="Consolas" w:cs="Consolas" w:eastAsia="Consolas" w:hAnsi="Consolas"/>
+          <w:rtl w:val="false"/>
+        </w:rPr>
+        <w:t xml:space="preserve">/dev/v4l/by-path/</w:t>
+      </w:r>
+      <w:r>
+        <w:rPr>
+          <w:rFonts w:ascii="Arial" w:cs="Arial" w:eastAsia="Arial" w:hAnsi="Arial"/>
+          <w:rtl w:val="false"/>
+        </w:rPr>
+        <w:t xml:space="preserve">, not by the video number, which can change between boots.</w:t>
+      </w:r>
+    </w:p>
+    <w:p>
+      <w:pPr>
+        <w:pStyle w:val="ListParagraph"/>
+        <w:numPr>
+          <w:ilvl w:val="0"/>
+          <w:numId w:val="3"/>
+        </w:numPr>
+        <w:spacing w:after="60" w:line="276"/>
+      </w:pPr>
+      <w:r>
+        <w:rPr>
+          <w:rFonts w:ascii="Arial" w:cs="Arial" w:eastAsia="Arial" w:hAnsi="Arial"/>
+          <w:rtl w:val="false"/>
+        </w:rPr>
+        <w:t xml:space="preserve">On the 32-bit Pi decode at most 1280x720 (or 640x480) MJPEG at 10–15 fps per camera, so that the audio processing keeps up. OpenCV: </w:t>
+      </w:r>
+      <w:r>
+        <w:rPr>
+          <w:rFonts w:ascii="Consolas" w:cs="Consolas" w:eastAsia="Consolas" w:hAnsi="Consolas"/>
+          <w:rtl w:val="false"/>
+        </w:rPr>
+        <w:t xml:space="preserve">sudo apt install python3-opencv</w:t>
+      </w:r>
+      <w:r>
+        <w:rPr>
+          <w:rFonts w:ascii="Arial" w:cs="Arial" w:eastAsia="Arial" w:hAnsi="Arial"/>
+          <w:rtl w:val="false"/>
+        </w:rPr>
+        <w:t xml:space="preserve"> and a venv created with </w:t>
+      </w:r>
+      <w:r>
+        <w:rPr>
+          <w:rFonts w:ascii="Consolas" w:cs="Consolas" w:eastAsia="Consolas" w:hAnsi="Consolas"/>
+          <w:rtl w:val="false"/>
+        </w:rPr>
+        <w:t xml:space="preserve">--system-site-packages</w:t>
+      </w:r>
+      <w:r>
+        <w:rPr>
+          <w:rFonts w:ascii="Arial" w:cs="Arial" w:eastAsia="Arial" w:hAnsi="Arial"/>
+          <w:rtl w:val="false"/>
+        </w:rPr>
+        <w:t xml:space="preserve">, or </w:t>
+      </w:r>
+      <w:r>
+        <w:rPr>
+          <w:rFonts w:ascii="Consolas" w:cs="Consolas" w:eastAsia="Consolas" w:hAnsi="Consolas"/>
+          <w:rtl w:val="false"/>
+        </w:rPr>
+        <w:t xml:space="preserve">pip install opencv-python-headless</w:t>
+      </w:r>
+      <w:r>
+        <w:rPr>
+          <w:rFonts w:ascii="Arial" w:cs="Arial" w:eastAsia="Arial" w:hAnsi="Arial"/>
+          <w:rtl w:val="false"/>
+        </w:rPr>
+        <w:t xml:space="preserve"> (piwheels).</w:t>
+      </w:r>
+    </w:p>
+    <w:p>
+      <w:pPr>
+        <w:pStyle w:val="ListParagraph"/>
+        <w:numPr>
+          <w:ilvl w:val="0"/>
+          <w:numId w:val="3"/>
+        </w:numPr>
+        <w:spacing w:after="60" w:line="276"/>
+      </w:pPr>
+      <w:r>
+        <w:rPr>
+          <w:rFonts w:ascii="Arial" w:cs="Arial" w:eastAsia="Arial" w:hAnsi="Arial"/>
+          <w:rtl w:val="false"/>
+        </w:rPr>
+        <w:t xml:space="preserve">Field of view about 58° diagonal (check): at 1280x720 that is about 0.04° per pixel, much finer than the expected acoustic error. Measure degrees per pixel once with a target at a known angle.</w:t>
+      </w:r>
+    </w:p>
+    <w:p>
+      <w:pPr>
+        <w:pStyle w:val="ListParagraph"/>
+        <w:numPr>
+          <w:ilvl w:val="0"/>
+          <w:numId w:val="3"/>
+        </w:numPr>
+        <w:spacing w:after="60" w:line="276"/>
+      </w:pPr>
+      <w:r>
+        <w:rPr>
+          <w:rFonts w:ascii="Arial" w:cs="Arial" w:eastAsia="Arial" w:hAnsi="Arial"/>
+          <w:rtl w:val="false"/>
+        </w:rPr>
+        <w:t xml:space="preserve">The built-in microphone of the Brio 100 is not used for localization (it runs on a different clock from the array).</w:t>
+      </w:r>
+    </w:p>
+    <w:p>
+      <w:pPr>
+        <w:pStyle w:val="ListParagraph"/>
+        <w:numPr>
+          <w:ilvl w:val="0"/>
+          <w:numId w:val="3"/>
+        </w:numPr>
+        <w:spacing w:after="60" w:line="276"/>
+      </w:pPr>
+      <w:r>
+        <w:rPr>
+          <w:rFonts w:ascii="Arial" w:cs="Arial" w:eastAsia="Arial" w:hAnsi="Arial"/>
+          <w:rtl w:val="false"/>
+        </w:rPr>
+        <w:t xml:space="preserve">Mount: remove the monitor clip if possible to save weight; align the camera optical axis with the pan/tilt axes (boresight) and record the offset during calibration.</w:t>
+      </w:r>
+    </w:p>
+    <w:p>
+      <w:pPr>
+        <w:pStyle w:val="Heading2"/>
+      </w:pPr>
+      <w:r>
+        <w:rPr>
+          <w:rFonts w:ascii="Arial" w:cs="Arial" w:eastAsia="Arial" w:hAnsi="Arial"/>
+          <w:rtl w:val="false"/>
+        </w:rPr>
+        <w:t xml:space="preserve">6.5 Host side to write</w:t>
       </w:r>
     </w:p>
     <w:p>
@@ -9803,7 +9065,7 @@
           <w:rFonts w:ascii="Arial" w:cs="Arial" w:eastAsia="Arial" w:hAnsi="Arial"/>
           <w:rtl w:val="false"/>
         </w:rPr>
-        <w:t xml:space="preserve">: send the (smoothed, rate-limited) direction to Pico 2; move only when the change exceeds 2–3°, and preferably between listening windows, because the servos themselves make noise that the array hears. Mount the pan/tilt head at least 50 cm from the sphere (MG995 gears are loud).</w:t>
+        <w:t xml:space="preserve">: send the smoothed, rate-limited direction to Pico 2 with head selection; move only when the change exceeds 2–3°, preferably between listening windows, because four MG995 are loud. Mount the heads at least 50 cm from the sphere.</w:t>
       </w:r>
     </w:p>
     <w:p>
@@ -9820,7 +9082,7 @@
           <w:rFonts w:ascii="Arial" w:cs="Arial" w:eastAsia="Arial" w:hAnsi="Arial"/>
           <w:rtl w:val="false"/>
         </w:rPr>
-        <w:t xml:space="preserve">Viewer/recorder: show the camera image with a centre mark, overlay az/el, record frames and estimates with timestamps.</w:t>
+        <w:t xml:space="preserve">Viewer/recorder for both cameras: centre mark, az/el overlay, recording of frames and estimates with timestamps.</w:t>
       </w:r>
     </w:p>
     <w:p>
@@ -9837,7 +9099,7 @@
           <w:rFonts w:ascii="Arial" w:cs="Arial" w:eastAsia="Arial" w:hAnsi="Arial"/>
           <w:rtl w:val="false"/>
         </w:rPr>
-        <w:t xml:space="preserve">Calibration: point at known loudspeaker positions, fit the pan/tilt zero offsets and the rotation between the array frame and the pan/tilt frame; save to a small JSON file used by --pointer.</w:t>
+        <w:t xml:space="preserve">Calibration per head: point at known loudspeaker positions, fit pan/tilt offsets, direction signs and the frame rotation; save to JSON.</w:t>
       </w:r>
     </w:p>
     <w:p>
@@ -9854,7 +9116,7 @@
           <w:rFonts w:ascii="Arial" w:cs="Arial" w:eastAsia="Arial" w:hAnsi="Arial"/>
           <w:rtl w:val="false"/>
         </w:rPr>
-        <w:t xml:space="preserve">Error measurement: angular error from the pixel offset of the target to the image centre (degrees per pixel from the lens field of view, measured once with a target at a known angle).</w:t>
+        <w:t xml:space="preserve">Error measurement: angular error from the pixel offset of the target to the image centre (simple marker or LED on the loudspeaker indoors; drone detection outdoors).</w:t>
       </w:r>
     </w:p>
     <w:p>
@@ -9866,7 +9128,7 @@
           <w:rFonts w:ascii="Arial" w:cs="Arial" w:eastAsia="Arial" w:hAnsi="Arial"/>
           <w:rtl w:val="false"/>
         </w:rPr>
-        <w:t xml:space="preserve">6.5 Shopping list for this part</w:t>
+        <w:t xml:space="preserve">6.6 Shopping list for this part</w:t>
       </w:r>
     </w:p>
     <w:tbl>
@@ -10012,7 +9274,7 @@
                 <w:szCs w:val="19"/>
                 <w:rtl w:val="false"/>
               </w:rPr>
-              <w:t xml:space="preserve">Pan/tilt bracket for standard-size servos (MG995/MG996R), metal</w:t>
+              <w:t xml:space="preserve">Metal pan/tilt bracket for standard-size servos (MG995/MG996R)</w:t>
             </w:r>
           </w:p>
         </w:tc>
@@ -10040,7 +9302,7 @@
                 <w:szCs w:val="19"/>
                 <w:rtl w:val="false"/>
               </w:rPr>
-              <w:t xml:space="preserve">1</w:t>
+              <w:t xml:space="preserve">2</w:t>
             </w:r>
           </w:p>
         </w:tc>
@@ -10068,7 +9330,7 @@
                 <w:szCs w:val="19"/>
                 <w:rtl w:val="false"/>
               </w:rPr>
-              <w:t xml:space="preserve">Must carry camera + laser</w:t>
+              <w:t xml:space="preserve">One per head</w:t>
             </w:r>
           </w:p>
         </w:tc>
@@ -10129,7 +9391,7 @@
                 <w:szCs w:val="19"/>
                 <w:rtl w:val="false"/>
               </w:rPr>
-              <w:t xml:space="preserve">2 (+1 spare)</w:t>
+              <w:t xml:space="preserve">4 (+1 spare)</w:t>
             </w:r>
           </w:p>
         </w:tc>
@@ -10190,7 +9452,7 @@
                 <w:szCs w:val="19"/>
                 <w:rtl w:val="false"/>
               </w:rPr>
-              <w:t xml:space="preserve">Red laser module 650 nm, &lt; 1 mW</w:t>
+              <w:t xml:space="preserve">5 V / 5 A supply and 1000 µF / 16 V capacitor</w:t>
             </w:r>
           </w:p>
         </w:tc>
@@ -10218,7 +9480,7 @@
                 <w:szCs w:val="19"/>
                 <w:rtl w:val="false"/>
               </w:rPr>
-              <w:t xml:space="preserve">1</w:t>
+              <w:t xml:space="preserve">2 each</w:t>
             </w:r>
           </w:p>
         </w:tc>
@@ -10246,7 +9508,7 @@
                 <w:szCs w:val="19"/>
                 <w:rtl w:val="false"/>
               </w:rPr>
-              <w:t xml:space="preserve">Indoor tests only</w:t>
+              <w:t xml:space="preserve">One per head</w:t>
             </w:r>
           </w:p>
         </w:tc>
@@ -10279,7 +9541,7 @@
                 <w:szCs w:val="19"/>
                 <w:rtl w:val="false"/>
               </w:rPr>
-              <w:t xml:space="preserve">NPN transistor 2N2222 or S8050, 1 kΩ resistor</w:t>
+              <w:t xml:space="preserve">Second Raspberry Pi Pico (RP2040)</w:t>
             </w:r>
           </w:p>
         </w:tc>
@@ -10307,7 +9569,7 @@
                 <w:szCs w:val="19"/>
                 <w:rtl w:val="false"/>
               </w:rPr>
-              <w:t xml:space="preserve">1 each</w:t>
+              <w:t xml:space="preserve">1</w:t>
             </w:r>
           </w:p>
         </w:tc>
@@ -10335,7 +9597,7 @@
                 <w:szCs w:val="19"/>
                 <w:rtl w:val="false"/>
               </w:rPr>
-              <w:t xml:space="preserve">Laser switch</w:t>
+              <w:t xml:space="preserve">Servo controller; keeps servo noise off the audio Pico</w:t>
             </w:r>
           </w:p>
         </w:tc>
@@ -10368,7 +9630,7 @@
                 <w:szCs w:val="19"/>
                 <w:rtl w:val="false"/>
               </w:rPr>
-              <w:t xml:space="preserve">5 V / 5 A supply and 1000 µF / 16 V capacitor</w:t>
+              <w:t xml:space="preserve">Logitech Brio 100 webcam</w:t>
             </w:r>
           </w:p>
         </w:tc>
@@ -10396,7 +9658,7 @@
                 <w:szCs w:val="19"/>
                 <w:rtl w:val="false"/>
               </w:rPr>
-              <w:t xml:space="preserve">1 each</w:t>
+              <w:t xml:space="preserve">2</w:t>
             </w:r>
           </w:p>
         </w:tc>
@@ -10424,7 +9686,7 @@
                 <w:szCs w:val="19"/>
                 <w:rtl w:val="false"/>
               </w:rPr>
-              <w:t xml:space="preserve">Servo and laser power (not 6 V: the laser module is 3–5 V)</w:t>
+              <w:t xml:space="preserve">Owned by the user</w:t>
             </w:r>
           </w:p>
         </w:tc>
@@ -10457,7 +9719,7 @@
                 <w:szCs w:val="19"/>
                 <w:rtl w:val="false"/>
               </w:rPr>
-              <w:t xml:space="preserve">2 x 4.7 kΩ resistors</w:t>
+              <w:t xml:space="preserve">Thick power wire, Dupont wires, terminal blocks</w:t>
             </w:r>
           </w:p>
         </w:tc>
@@ -10485,7 +9747,7 @@
                 <w:szCs w:val="19"/>
                 <w:rtl w:val="false"/>
               </w:rPr>
-              <w:t xml:space="preserve">2</w:t>
+              <w:t xml:space="preserve">—</w:t>
             </w:r>
           </w:p>
         </w:tc>
@@ -10513,274 +9775,7 @@
                 <w:szCs w:val="19"/>
                 <w:rtl w:val="false"/>
               </w:rPr>
-              <w:t xml:space="preserve">SCCB pull-ups (many blue OV7670 boards lack them)</w:t>
-            </w:r>
-          </w:p>
-        </w:tc>
-      </w:tr>
-      <w:tr>
-        <w:trPr>
-          <w:cantSplit/>
-        </w:trPr>
-        <w:tc>
-          <w:tcPr>
-            <w:tcW w:type="dxa" w:w="4600"/>
-            <w:tcBorders>
-              <w:top w:val="single" w:color="BBBBBB" w:sz="4"/>
-              <w:left w:val="single" w:color="BBBBBB" w:sz="4"/>
-              <w:bottom w:val="single" w:color="BBBBBB" w:sz="4"/>
-              <w:right w:val="single" w:color="BBBBBB" w:sz="4"/>
-            </w:tcBorders>
-            <w:tcMar>
-              <w:top w:type="dxa" w:w="50"/>
-              <w:left w:type="dxa" w:w="90"/>
-              <w:bottom w:type="dxa" w:w="50"/>
-              <w:right w:type="dxa" w:w="90"/>
-            </w:tcMar>
-          </w:tcPr>
-          <w:p>
-            <w:r>
-              <w:rPr>
-                <w:rFonts w:ascii="Arial" w:cs="Arial" w:eastAsia="Arial" w:hAnsi="Arial"/>
-                <w:sz w:val="19"/>
-                <w:szCs w:val="19"/>
-                <w:rtl w:val="false"/>
-              </w:rPr>
-              <w:t xml:space="preserve">Second Raspberry Pi Pico (RP2040)</w:t>
-            </w:r>
-          </w:p>
-        </w:tc>
-        <w:tc>
-          <w:tcPr>
-            <w:tcW w:type="dxa" w:w="1600"/>
-            <w:tcBorders>
-              <w:top w:val="single" w:color="BBBBBB" w:sz="4"/>
-              <w:left w:val="single" w:color="BBBBBB" w:sz="4"/>
-              <w:bottom w:val="single" w:color="BBBBBB" w:sz="4"/>
-              <w:right w:val="single" w:color="BBBBBB" w:sz="4"/>
-            </w:tcBorders>
-            <w:tcMar>
-              <w:top w:type="dxa" w:w="50"/>
-              <w:left w:type="dxa" w:w="90"/>
-              <w:bottom w:type="dxa" w:w="50"/>
-              <w:right w:type="dxa" w:w="90"/>
-            </w:tcMar>
-          </w:tcPr>
-          <w:p>
-            <w:r>
-              <w:rPr>
-                <w:rFonts w:ascii="Arial" w:cs="Arial" w:eastAsia="Arial" w:hAnsi="Arial"/>
-                <w:sz w:val="19"/>
-                <w:szCs w:val="19"/>
-                <w:rtl w:val="false"/>
-              </w:rPr>
-              <w:t xml:space="preserve">1</w:t>
-            </w:r>
-          </w:p>
-        </w:tc>
-        <w:tc>
-          <w:tcPr>
-            <w:tcW w:type="dxa" w:w="3400"/>
-            <w:tcBorders>
-              <w:top w:val="single" w:color="BBBBBB" w:sz="4"/>
-              <w:left w:val="single" w:color="BBBBBB" w:sz="4"/>
-              <w:bottom w:val="single" w:color="BBBBBB" w:sz="4"/>
-              <w:right w:val="single" w:color="BBBBBB" w:sz="4"/>
-            </w:tcBorders>
-            <w:tcMar>
-              <w:top w:type="dxa" w:w="50"/>
-              <w:left w:type="dxa" w:w="90"/>
-              <w:bottom w:type="dxa" w:w="50"/>
-              <w:right w:type="dxa" w:w="90"/>
-            </w:tcMar>
-          </w:tcPr>
-          <w:p>
-            <w:r>
-              <w:rPr>
-                <w:rFonts w:ascii="Arial" w:cs="Arial" w:eastAsia="Arial" w:hAnsi="Arial"/>
-                <w:sz w:val="19"/>
-                <w:szCs w:val="19"/>
-                <w:rtl w:val="false"/>
-              </w:rPr>
-              <w:t xml:space="preserve">Keeps camera and servos off the audio Pico</w:t>
-            </w:r>
-          </w:p>
-        </w:tc>
-      </w:tr>
-      <w:tr>
-        <w:trPr>
-          <w:cantSplit/>
-        </w:trPr>
-        <w:tc>
-          <w:tcPr>
-            <w:tcW w:type="dxa" w:w="4600"/>
-            <w:tcBorders>
-              <w:top w:val="single" w:color="BBBBBB" w:sz="4"/>
-              <w:left w:val="single" w:color="BBBBBB" w:sz="4"/>
-              <w:bottom w:val="single" w:color="BBBBBB" w:sz="4"/>
-              <w:right w:val="single" w:color="BBBBBB" w:sz="4"/>
-            </w:tcBorders>
-            <w:tcMar>
-              <w:top w:type="dxa" w:w="50"/>
-              <w:left w:type="dxa" w:w="90"/>
-              <w:bottom w:type="dxa" w:w="50"/>
-              <w:right w:type="dxa" w:w="90"/>
-            </w:tcMar>
-          </w:tcPr>
-          <w:p>
-            <w:r>
-              <w:rPr>
-                <w:rFonts w:ascii="Arial" w:cs="Arial" w:eastAsia="Arial" w:hAnsi="Arial"/>
-                <w:sz w:val="19"/>
-                <w:szCs w:val="19"/>
-                <w:rtl w:val="false"/>
-              </w:rPr>
-              <w:t xml:space="preserve">Short female–female Dupont wires</w:t>
-            </w:r>
-          </w:p>
-        </w:tc>
-        <w:tc>
-          <w:tcPr>
-            <w:tcW w:type="dxa" w:w="1600"/>
-            <w:tcBorders>
-              <w:top w:val="single" w:color="BBBBBB" w:sz="4"/>
-              <w:left w:val="single" w:color="BBBBBB" w:sz="4"/>
-              <w:bottom w:val="single" w:color="BBBBBB" w:sz="4"/>
-              <w:right w:val="single" w:color="BBBBBB" w:sz="4"/>
-            </w:tcBorders>
-            <w:tcMar>
-              <w:top w:type="dxa" w:w="50"/>
-              <w:left w:type="dxa" w:w="90"/>
-              <w:bottom w:type="dxa" w:w="50"/>
-              <w:right w:type="dxa" w:w="90"/>
-            </w:tcMar>
-          </w:tcPr>
-          <w:p>
-            <w:r>
-              <w:rPr>
-                <w:rFonts w:ascii="Arial" w:cs="Arial" w:eastAsia="Arial" w:hAnsi="Arial"/>
-                <w:sz w:val="19"/>
-                <w:szCs w:val="19"/>
-                <w:rtl w:val="false"/>
-              </w:rPr>
-              <w:t xml:space="preserve">~25</w:t>
-            </w:r>
-          </w:p>
-        </w:tc>
-        <w:tc>
-          <w:tcPr>
-            <w:tcW w:type="dxa" w:w="3400"/>
-            <w:tcBorders>
-              <w:top w:val="single" w:color="BBBBBB" w:sz="4"/>
-              <w:left w:val="single" w:color="BBBBBB" w:sz="4"/>
-              <w:bottom w:val="single" w:color="BBBBBB" w:sz="4"/>
-              <w:right w:val="single" w:color="BBBBBB" w:sz="4"/>
-            </w:tcBorders>
-            <w:tcMar>
-              <w:top w:type="dxa" w:w="50"/>
-              <w:left w:type="dxa" w:w="90"/>
-              <w:bottom w:type="dxa" w:w="50"/>
-              <w:right w:type="dxa" w:w="90"/>
-            </w:tcMar>
-          </w:tcPr>
-          <w:p>
-            <w:r>
-              <w:rPr>
-                <w:rFonts w:ascii="Arial" w:cs="Arial" w:eastAsia="Arial" w:hAnsi="Arial"/>
-                <w:sz w:val="19"/>
-                <w:szCs w:val="19"/>
-                <w:rtl w:val="false"/>
-              </w:rPr>
-              <w:t xml:space="preserve">Camera to Pico, under 15 cm</w:t>
-            </w:r>
-          </w:p>
-        </w:tc>
-      </w:tr>
-      <w:tr>
-        <w:trPr>
-          <w:cantSplit/>
-        </w:trPr>
-        <w:tc>
-          <w:tcPr>
-            <w:tcW w:type="dxa" w:w="4600"/>
-            <w:tcBorders>
-              <w:top w:val="single" w:color="BBBBBB" w:sz="4"/>
-              <w:left w:val="single" w:color="BBBBBB" w:sz="4"/>
-              <w:bottom w:val="single" w:color="BBBBBB" w:sz="4"/>
-              <w:right w:val="single" w:color="BBBBBB" w:sz="4"/>
-            </w:tcBorders>
-            <w:tcMar>
-              <w:top w:type="dxa" w:w="50"/>
-              <w:left w:type="dxa" w:w="90"/>
-              <w:bottom w:type="dxa" w:w="50"/>
-              <w:right w:type="dxa" w:w="90"/>
-            </w:tcMar>
-          </w:tcPr>
-          <w:p>
-            <w:r>
-              <w:rPr>
-                <w:rFonts w:ascii="Arial" w:cs="Arial" w:eastAsia="Arial" w:hAnsi="Arial"/>
-                <w:sz w:val="19"/>
-                <w:szCs w:val="19"/>
-                <w:rtl w:val="false"/>
-              </w:rPr>
-              <w:t xml:space="preserve">Optional: USB webcam</w:t>
-            </w:r>
-          </w:p>
-        </w:tc>
-        <w:tc>
-          <w:tcPr>
-            <w:tcW w:type="dxa" w:w="1600"/>
-            <w:tcBorders>
-              <w:top w:val="single" w:color="BBBBBB" w:sz="4"/>
-              <w:left w:val="single" w:color="BBBBBB" w:sz="4"/>
-              <w:bottom w:val="single" w:color="BBBBBB" w:sz="4"/>
-              <w:right w:val="single" w:color="BBBBBB" w:sz="4"/>
-            </w:tcBorders>
-            <w:tcMar>
-              <w:top w:type="dxa" w:w="50"/>
-              <w:left w:type="dxa" w:w="90"/>
-              <w:bottom w:type="dxa" w:w="50"/>
-              <w:right w:type="dxa" w:w="90"/>
-            </w:tcMar>
-          </w:tcPr>
-          <w:p>
-            <w:r>
-              <w:rPr>
-                <w:rFonts w:ascii="Arial" w:cs="Arial" w:eastAsia="Arial" w:hAnsi="Arial"/>
-                <w:sz w:val="19"/>
-                <w:szCs w:val="19"/>
-                <w:rtl w:val="false"/>
-              </w:rPr>
-              <w:t xml:space="preserve">1</w:t>
-            </w:r>
-          </w:p>
-        </w:tc>
-        <w:tc>
-          <w:tcPr>
-            <w:tcW w:type="dxa" w:w="3400"/>
-            <w:tcBorders>
-              <w:top w:val="single" w:color="BBBBBB" w:sz="4"/>
-              <w:left w:val="single" w:color="BBBBBB" w:sz="4"/>
-              <w:bottom w:val="single" w:color="BBBBBB" w:sz="4"/>
-              <w:right w:val="single" w:color="BBBBBB" w:sz="4"/>
-            </w:tcBorders>
-            <w:tcMar>
-              <w:top w:type="dxa" w:w="50"/>
-              <w:left w:type="dxa" w:w="90"/>
-              <w:bottom w:type="dxa" w:w="50"/>
-              <w:right w:type="dxa" w:w="90"/>
-            </w:tcMar>
-          </w:tcPr>
-          <w:p>
-            <w:r>
-              <w:rPr>
-                <w:rFonts w:ascii="Arial" w:cs="Arial" w:eastAsia="Arial" w:hAnsi="Arial"/>
-                <w:sz w:val="19"/>
-                <w:szCs w:val="19"/>
-                <w:rtl w:val="false"/>
-              </w:rPr>
-              <w:t xml:space="preserve">Better than OV7670 for outdoor tests; plugs into the Pi directly</w:t>
+              <w:t xml:space="preserve">Servo power and signals</w:t>
             </w:r>
           </w:p>
         </w:tc>
@@ -10846,7 +9841,7 @@
           <w:rFonts w:ascii="Arial" w:cs="Arial" w:eastAsia="Arial" w:hAnsi="Arial"/>
           <w:rtl w:val="false"/>
         </w:rPr>
-        <w:t xml:space="preserve">Write the Pico 2 firmware and the host side (section 6), test indoors with a loudspeaker and the laser.</w:t>
+        <w:t xml:space="preserve">Write the Pico 2 firmware and the host side for the two heads and cameras (section 6); test indoors with a loudspeaker.</w:t>
       </w:r>
     </w:p>
     <w:p>

</xml_diff>